<commit_message>
. Correção da Geração de Relatório .DOCX
</commit_message>
<xml_diff>
--- a/public/docs/MODEL_RELATORIO_CONFORMIDADE_OSC_REV00_20.04.2026_.docx
+++ b/public/docs/MODEL_RELATORIO_CONFORMIDADE_OSC_REV00_20.04.2026_.docx
@@ -1,5 +1,56 @@
 
-<file path=word/document.xml><?xml version="1.0" encoding="utf-8"?>
+<file path=docProps\app.xml><?xml version="1.0" encoding="utf-8"?>
+<Properties xmlns="http://schemas.openxmlformats.org/officeDocument/2006/extended-properties" xmlns:vt="http://schemas.openxmlformats.org/officeDocument/2006/docPropsVTypes">
+  <Template>Normal.dotm</Template>
+  <TotalTime>9</TotalTime>
+  <Pages>3</Pages>
+  <Words>560</Words>
+  <Characters>3030</Characters>
+  <Application>Microsoft Office Word</Application>
+  <DocSecurity>0</DocSecurity>
+  <Lines>25</Lines>
+  <Paragraphs>7</Paragraphs>
+  <ScaleCrop>false</ScaleCrop>
+  <HeadingPairs>
+    <vt:vector size="2" baseType="variant">
+      <vt:variant>
+        <vt:lpstr>Título</vt:lpstr>
+      </vt:variant>
+      <vt:variant>
+        <vt:i4>1</vt:i4>
+      </vt:variant>
+    </vt:vector>
+  </HeadingPairs>
+  <TitlesOfParts>
+    <vt:vector size="1" baseType="lpstr">
+      <vt:lpstr/>
+    </vt:vector>
+  </TitlesOfParts>
+  <Company/>
+  <LinksUpToDate>false</LinksUpToDate>
+  <CharactersWithSpaces>3583</CharactersWithSpaces>
+  <SharedDoc>false</SharedDoc>
+  <HyperlinksChanged>false</HyperlinksChanged>
+  <AppVersion>16.0000</AppVersion>
+</Properties>
+</file>
+
+<file path=docProps\core.xml><?xml version="1.0" encoding="utf-8"?>
+<cp:coreProperties xmlns:cp="http://schemas.openxmlformats.org/package/2006/metadata/core-properties" xmlns:dc="http://purl.org/dc/elements/1.1/" xmlns:dcterms="http://purl.org/dc/terms/" xmlns:dcmitype="http://purl.org/dc/dcmitype/" xmlns:xsi="http://www.w3.org/2001/XMLSchema-instance">
+  <dc:title/>
+  <dc:subject/>
+  <dc:creator>Carlos Coelho</dc:creator>
+  <cp:keywords/>
+  <dc:description/>
+  <cp:lastModifiedBy>Carlos Coelho</cp:lastModifiedBy>
+  <cp:revision>8</cp:revision>
+  <cp:lastPrinted>2026-04-18T21:12:00Z</cp:lastPrinted>
+  <dcterms:created xsi:type="dcterms:W3CDTF">2026-04-20T22:55:00Z</dcterms:created>
+  <dcterms:modified xsi:type="dcterms:W3CDTF">2026-04-20T23:12:00Z</dcterms:modified>
+</cp:coreProperties>
+</file>
+
+<file path=word\document.xml><?xml version="1.0" encoding="utf-8"?>
 <w:document xmlns:wpc="http://schemas.microsoft.com/office/word/2010/wordprocessingCanvas" xmlns:cx="http://schemas.microsoft.com/office/drawing/2014/chartex" xmlns:cx1="http://schemas.microsoft.com/office/drawing/2015/9/8/chartex" xmlns:cx2="http://schemas.microsoft.com/office/drawing/2015/10/21/chartex" xmlns:cx3="http://schemas.microsoft.com/office/drawing/2016/5/9/chartex" xmlns:cx4="http://schemas.microsoft.com/office/drawing/2016/5/10/chartex" xmlns:cx5="http://schemas.microsoft.com/office/drawing/2016/5/11/chartex" xmlns:cx6="http://schemas.microsoft.com/office/drawing/2016/5/12/chartex" xmlns:cx7="http://schemas.microsoft.com/office/drawing/2016/5/13/chartex" xmlns:cx8="http://schemas.microsoft.com/office/drawing/2016/5/14/chartex" xmlns:mc="http://schemas.openxmlformats.org/markup-compatibility/2006" xmlns:aink="http://schemas.microsoft.com/office/drawing/2016/ink" xmlns:am3d="http://schemas.microsoft.com/office/drawing/2017/model3d" xmlns:o="urn:schemas-microsoft-com:office:office" xmlns:oel="http://schemas.microsoft.com/office/2019/extlst" xmlns:r="http://schemas.openxmlformats.org/officeDocument/2006/relationships" xmlns:m="http://schemas.openxmlformats.org/officeDocument/2006/math" xmlns:v="urn:schemas-microsoft-com:vml" xmlns:wp14="http://schemas.microsoft.com/office/word/2010/wordprocessingDrawing" xmlns:wp="http://schemas.openxmlformats.org/drawingml/2006/wordprocessingDrawing" xmlns:w10="urn:schemas-microsoft-com:office:word" xmlns:w="http://schemas.openxmlformats.org/wordprocessingml/2006/main" xmlns:w14="http://schemas.microsoft.com/office/word/2010/wordml" xmlns:w15="http://schemas.microsoft.com/office/word/2012/wordml" xmlns:w16cex="http://schemas.microsoft.com/office/word/2018/wordml/cex" xmlns:w16cid="http://schemas.microsoft.com/office/word/2016/wordml/cid" xmlns:w16="http://schemas.microsoft.com/office/word/2018/wordml" xmlns:w16du="http://schemas.microsoft.com/office/word/2023/wordml/word16du" xmlns:w16sdtdh="http://schemas.microsoft.com/office/word/2020/wordml/sdtdatahash" xmlns:w16sdtfl="http://schemas.microsoft.com/office/word/2024/wordml/sdtformatlock" xmlns:w16se="http://schemas.microsoft.com/office/word/2015/wordml/symex" xmlns:wpg="http://schemas.microsoft.com/office/word/2010/wordprocessingGroup" xmlns:wpi="http://schemas.microsoft.com/office/word/2010/wordprocessingInk" xmlns:wne="http://schemas.microsoft.com/office/word/2006/wordml" xmlns:wps="http://schemas.microsoft.com/office/word/2010/wordprocessingShape" mc:Ignorable="w14 w15 w16se w16cid w16 w16cex w16sdtdh w16sdtfl w16du wp14">
   <w:body>
     <w:p>
@@ -169,6 +220,9 @@
                 <w:szCs w:val="20"/>
               </w:rPr>
             </w:pPr>
+            <w:r>
+              <w:t>{cnpj}</w:t>
+            </w:r>
           </w:p>
         </w:tc>
       </w:tr>
@@ -211,6 +265,9 @@
                 <w:szCs w:val="20"/>
               </w:rPr>
             </w:pPr>
+            <w:r>
+              <w:t>{natureza_juridica}</w:t>
+            </w:r>
           </w:p>
         </w:tc>
       </w:tr>
@@ -253,6 +310,9 @@
                 <w:szCs w:val="20"/>
               </w:rPr>
             </w:pPr>
+            <w:r>
+              <w:t>{razao_social}</w:t>
+            </w:r>
           </w:p>
         </w:tc>
       </w:tr>
@@ -345,6 +405,9 @@
                 <w:szCs w:val="20"/>
               </w:rPr>
             </w:pPr>
+            <w:r>
+              <w:t>{endereco}</w:t>
+            </w:r>
           </w:p>
         </w:tc>
       </w:tr>
@@ -387,6 +450,9 @@
                 <w:szCs w:val="20"/>
               </w:rPr>
             </w:pPr>
+            <w:r>
+              <w:t>{data_abertura}</w:t>
+            </w:r>
           </w:p>
         </w:tc>
       </w:tr>
@@ -429,6 +495,9 @@
                 <w:szCs w:val="20"/>
               </w:rPr>
             </w:pPr>
+            <w:r>
+              <w:t>{email}</w:t>
+            </w:r>
           </w:p>
         </w:tc>
       </w:tr>
@@ -471,6 +540,9 @@
                 <w:szCs w:val="20"/>
               </w:rPr>
             </w:pPr>
+            <w:r>
+              <w:t>{telefone}</w:t>
+            </w:r>
           </w:p>
         </w:tc>
       </w:tr>
@@ -690,6 +762,18 @@
                 <w:szCs w:val="20"/>
               </w:rPr>
             </w:pPr>
+            <w:r>
+              <w:t>{hj_2_1_codigo}</w:t>
+            </w:r>
+            <w:r>
+              <w:t>{hj_2_1_emissao}</w:t>
+            </w:r>
+            <w:r>
+              <w:t>{hj_2_1_validade}</w:t>
+            </w:r>
+            <w:r>
+              <w:t>{hj_2_1_status}</w:t>
+            </w:r>
           </w:p>
         </w:tc>
         <w:tc>
@@ -878,6 +962,18 @@
                 <w:szCs w:val="20"/>
               </w:rPr>
             </w:pPr>
+            <w:r>
+              <w:t>{hj_2_3_codigo}</w:t>
+            </w:r>
+            <w:r>
+              <w:t>{hj_2_3_emissao}</w:t>
+            </w:r>
+            <w:r>
+              <w:t>{hj_2_3_validade}</w:t>
+            </w:r>
+            <w:r>
+              <w:t>{hj_2_3_status}</w:t>
+            </w:r>
           </w:p>
         </w:tc>
         <w:tc>
@@ -968,6 +1064,18 @@
                 <w:szCs w:val="20"/>
               </w:rPr>
             </w:pPr>
+            <w:r>
+              <w:t>{hj_2_4_codigo}</w:t>
+            </w:r>
+            <w:r>
+              <w:t>{hj_2_4_emissao}</w:t>
+            </w:r>
+            <w:r>
+              <w:t>{hj_2_4_validade}</w:t>
+            </w:r>
+            <w:r>
+              <w:t>{hj_2_4_status}</w:t>
+            </w:r>
           </w:p>
         </w:tc>
         <w:tc>
@@ -1058,6 +1166,18 @@
                 <w:szCs w:val="20"/>
               </w:rPr>
             </w:pPr>
+            <w:r>
+              <w:t>{hj_2_5_codigo}</w:t>
+            </w:r>
+            <w:r>
+              <w:t>{hj_2_5_emissao}</w:t>
+            </w:r>
+            <w:r>
+              <w:t>{hj_2_5_validade}</w:t>
+            </w:r>
+            <w:r>
+              <w:t>{hj_2_5_status}</w:t>
+            </w:r>
           </w:p>
         </w:tc>
         <w:tc>
@@ -1148,6 +1268,18 @@
                 <w:szCs w:val="20"/>
               </w:rPr>
             </w:pPr>
+            <w:r>
+              <w:t>{hj_2_6_codigo}</w:t>
+            </w:r>
+            <w:r>
+              <w:t>{hj_2_6_emissao}</w:t>
+            </w:r>
+            <w:r>
+              <w:t>{hj_2_6_validade}</w:t>
+            </w:r>
+            <w:r>
+              <w:t>{hj_2_6_status}</w:t>
+            </w:r>
           </w:p>
         </w:tc>
         <w:tc>
@@ -1238,6 +1370,18 @@
                 <w:szCs w:val="20"/>
               </w:rPr>
             </w:pPr>
+            <w:r>
+              <w:t>{hj_2_7_codigo}</w:t>
+            </w:r>
+            <w:r>
+              <w:t>{hj_2_7_emissao}</w:t>
+            </w:r>
+            <w:r>
+              <w:t>{hj_2_7_validade}</w:t>
+            </w:r>
+            <w:r>
+              <w:t>{hj_2_7_status}</w:t>
+            </w:r>
           </w:p>
         </w:tc>
         <w:tc>
@@ -1328,6 +1472,18 @@
                 <w:szCs w:val="20"/>
               </w:rPr>
             </w:pPr>
+            <w:r>
+              <w:t>{hj_2_8_codigo}</w:t>
+            </w:r>
+            <w:r>
+              <w:t>{hj_2_8_emissao}</w:t>
+            </w:r>
+            <w:r>
+              <w:t>{hj_2_8_validade}</w:t>
+            </w:r>
+            <w:r>
+              <w:t>{hj_2_8_status}</w:t>
+            </w:r>
           </w:p>
         </w:tc>
         <w:tc>
@@ -1418,6 +1574,18 @@
                 <w:szCs w:val="20"/>
               </w:rPr>
             </w:pPr>
+            <w:r>
+              <w:t>{hj_2_9_codigo}</w:t>
+            </w:r>
+            <w:r>
+              <w:t>{hj_2_9_emissao}</w:t>
+            </w:r>
+            <w:r>
+              <w:t>{hj_2_9_validade}</w:t>
+            </w:r>
+            <w:r>
+              <w:t>{hj_2_9_status}</w:t>
+            </w:r>
           </w:p>
         </w:tc>
         <w:tc>
@@ -1508,6 +1676,18 @@
                 <w:szCs w:val="20"/>
               </w:rPr>
             </w:pPr>
+            <w:r>
+              <w:t>{hj_2_10_codigo}</w:t>
+            </w:r>
+            <w:r>
+              <w:t>{hj_2_10_emissao}</w:t>
+            </w:r>
+            <w:r>
+              <w:t>{hj_2_10_validade}</w:t>
+            </w:r>
+            <w:r>
+              <w:t>{hj_2_10_status}</w:t>
+            </w:r>
           </w:p>
         </w:tc>
         <w:tc>
@@ -1598,6 +1778,18 @@
                 <w:szCs w:val="20"/>
               </w:rPr>
             </w:pPr>
+            <w:r>
+              <w:t>{hj_2_11_codigo}</w:t>
+            </w:r>
+            <w:r>
+              <w:t>{hj_2_11_emissao}</w:t>
+            </w:r>
+            <w:r>
+              <w:t>{hj_2_11_validade}</w:t>
+            </w:r>
+            <w:r>
+              <w:t>{hj_2_11_status}</w:t>
+            </w:r>
           </w:p>
         </w:tc>
         <w:tc>
@@ -1854,6 +2046,18 @@
                 <w:szCs w:val="20"/>
               </w:rPr>
             </w:pPr>
+            <w:r>
+              <w:t>{rf_3_1_codigo}</w:t>
+            </w:r>
+            <w:r>
+              <w:t>{rf_3_1_emissao}</w:t>
+            </w:r>
+            <w:r>
+              <w:t>{rf_3_1_validade}</w:t>
+            </w:r>
+            <w:r>
+              <w:t>{rf_3_1_status}</w:t>
+            </w:r>
           </w:p>
         </w:tc>
         <w:tc>
@@ -1941,6 +2145,18 @@
                 <w:szCs w:val="20"/>
               </w:rPr>
             </w:pPr>
+            <w:r>
+              <w:t>{rf_3_2_codigo}</w:t>
+            </w:r>
+            <w:r>
+              <w:t>{rf_3_2_emissao}</w:t>
+            </w:r>
+            <w:r>
+              <w:t>{rf_3_2_validade}</w:t>
+            </w:r>
+            <w:r>
+              <w:t>{rf_3_2_status}</w:t>
+            </w:r>
           </w:p>
         </w:tc>
         <w:tc>
@@ -2028,6 +2244,18 @@
                 <w:szCs w:val="20"/>
               </w:rPr>
             </w:pPr>
+            <w:r>
+              <w:t>{rf_3_3_codigo}</w:t>
+            </w:r>
+            <w:r>
+              <w:t>{rf_3_3_emissao}</w:t>
+            </w:r>
+            <w:r>
+              <w:t>{rf_3_3_validade}</w:t>
+            </w:r>
+            <w:r>
+              <w:t>{rf_3_3_status}</w:t>
+            </w:r>
           </w:p>
         </w:tc>
         <w:tc>
@@ -2115,6 +2343,18 @@
                 <w:szCs w:val="20"/>
               </w:rPr>
             </w:pPr>
+            <w:r>
+              <w:t>{rf_3_4_codigo}</w:t>
+            </w:r>
+            <w:r>
+              <w:t>{rf_3_4_emissao}</w:t>
+            </w:r>
+            <w:r>
+              <w:t>{rf_3_4_validade}</w:t>
+            </w:r>
+            <w:r>
+              <w:t>{rf_3_4_status}</w:t>
+            </w:r>
           </w:p>
         </w:tc>
         <w:tc>
@@ -2202,6 +2442,18 @@
                 <w:szCs w:val="20"/>
               </w:rPr>
             </w:pPr>
+            <w:r>
+              <w:t>{rf_3_5_codigo}</w:t>
+            </w:r>
+            <w:r>
+              <w:t>{rf_3_5_emissao}</w:t>
+            </w:r>
+            <w:r>
+              <w:t>{rf_3_5_validade}</w:t>
+            </w:r>
+            <w:r>
+              <w:t>{rf_3_5_status}</w:t>
+            </w:r>
           </w:p>
         </w:tc>
         <w:tc>
@@ -2289,6 +2541,18 @@
                 <w:szCs w:val="20"/>
               </w:rPr>
             </w:pPr>
+            <w:r>
+              <w:t>{rf_3_6_codigo}</w:t>
+            </w:r>
+            <w:r>
+              <w:t>{rf_3_6_emissao}</w:t>
+            </w:r>
+            <w:r>
+              <w:t>{rf_3_6_validade}</w:t>
+            </w:r>
+            <w:r>
+              <w:t>{rf_3_6_status}</w:t>
+            </w:r>
           </w:p>
         </w:tc>
         <w:tc>
@@ -2661,6 +2925,18 @@
                 <w:szCs w:val="20"/>
               </w:rPr>
             </w:pPr>
+            <w:r>
+              <w:t>{qe_4_1_codigo}</w:t>
+            </w:r>
+            <w:r>
+              <w:t>{qe_4_1_emissao}</w:t>
+            </w:r>
+            <w:r>
+              <w:t>{qe_4_1_validade}</w:t>
+            </w:r>
+            <w:r>
+              <w:t>{qe_4_1_status}</w:t>
+            </w:r>
           </w:p>
         </w:tc>
         <w:tc>
@@ -2748,6 +3024,18 @@
                 <w:szCs w:val="20"/>
               </w:rPr>
             </w:pPr>
+            <w:r>
+              <w:t>{qe_4_2_codigo}</w:t>
+            </w:r>
+            <w:r>
+              <w:t>{qe_4_2_emissao}</w:t>
+            </w:r>
+            <w:r>
+              <w:t>{qe_4_2_validade}</w:t>
+            </w:r>
+            <w:r>
+              <w:t>{qe_4_2_status}</w:t>
+            </w:r>
           </w:p>
         </w:tc>
         <w:tc>
@@ -2834,6 +3122,18 @@
                 <w:szCs w:val="20"/>
               </w:rPr>
             </w:pPr>
+            <w:r>
+              <w:t>{qe_4_3_codigo}</w:t>
+            </w:r>
+            <w:r>
+              <w:t>{qe_4_3_emissao}</w:t>
+            </w:r>
+            <w:r>
+              <w:t>{qe_4_3_validade}</w:t>
+            </w:r>
+            <w:r>
+              <w:t>{qe_4_3_status}</w:t>
+            </w:r>
           </w:p>
         </w:tc>
         <w:tc>
@@ -2928,6 +3228,18 @@
                 <w:szCs w:val="20"/>
               </w:rPr>
             </w:pPr>
+            <w:r>
+              <w:t>{qe_4_4_codigo}</w:t>
+            </w:r>
+            <w:r>
+              <w:t>{qe_4_4_emissao}</w:t>
+            </w:r>
+            <w:r>
+              <w:t>{qe_4_4_validade}</w:t>
+            </w:r>
+            <w:r>
+              <w:t>{qe_4_4_status}</w:t>
+            </w:r>
           </w:p>
         </w:tc>
         <w:tc>
@@ -3014,6 +3326,18 @@
                 <w:szCs w:val="20"/>
               </w:rPr>
             </w:pPr>
+            <w:r>
+              <w:t>{qe_4_5_codigo}</w:t>
+            </w:r>
+            <w:r>
+              <w:t>{qe_4_5_emissao}</w:t>
+            </w:r>
+            <w:r>
+              <w:t>{qe_4_5_validade}</w:t>
+            </w:r>
+            <w:r>
+              <w:t>{qe_4_5_status}</w:t>
+            </w:r>
           </w:p>
         </w:tc>
         <w:tc>
@@ -3100,6 +3424,18 @@
                 <w:szCs w:val="20"/>
               </w:rPr>
             </w:pPr>
+            <w:r>
+              <w:t>{qe_4_6_codigo}</w:t>
+            </w:r>
+            <w:r>
+              <w:t>{qe_4_6_emissao}</w:t>
+            </w:r>
+            <w:r>
+              <w:t>{qe_4_6_validade}</w:t>
+            </w:r>
+            <w:r>
+              <w:t>{qe_4_6_status}</w:t>
+            </w:r>
           </w:p>
         </w:tc>
         <w:tc>
@@ -3186,6 +3522,18 @@
                 <w:szCs w:val="20"/>
               </w:rPr>
             </w:pPr>
+            <w:r>
+              <w:t>{qe_4_7_codigo}</w:t>
+            </w:r>
+            <w:r>
+              <w:t>{qe_4_7_emissao}</w:t>
+            </w:r>
+            <w:r>
+              <w:t>{qe_4_7_validade}</w:t>
+            </w:r>
+            <w:r>
+              <w:t>{qe_4_7_status}</w:t>
+            </w:r>
           </w:p>
         </w:tc>
         <w:tc>
@@ -3272,6 +3620,18 @@
                 <w:szCs w:val="20"/>
               </w:rPr>
             </w:pPr>
+            <w:r>
+              <w:t>{qe_4_8_codigo}</w:t>
+            </w:r>
+            <w:r>
+              <w:t>{qe_4_8_emissao}</w:t>
+            </w:r>
+            <w:r>
+              <w:t>{qe_4_8_validade}</w:t>
+            </w:r>
+            <w:r>
+              <w:t>{qe_4_8_status}</w:t>
+            </w:r>
           </w:p>
         </w:tc>
         <w:tc>
@@ -3358,6 +3718,18 @@
                 <w:szCs w:val="20"/>
               </w:rPr>
             </w:pPr>
+            <w:r>
+              <w:t>{qe_4_9_codigo}</w:t>
+            </w:r>
+            <w:r>
+              <w:t>{qe_4_9_emissao}</w:t>
+            </w:r>
+            <w:r>
+              <w:t>{qe_4_9_validade}</w:t>
+            </w:r>
+            <w:r>
+              <w:t>{qe_4_9_status}</w:t>
+            </w:r>
           </w:p>
         </w:tc>
         <w:tc>
@@ -3444,6 +3816,18 @@
                 <w:szCs w:val="20"/>
               </w:rPr>
             </w:pPr>
+            <w:r>
+              <w:t>{qe_4_10_codigo}</w:t>
+            </w:r>
+            <w:r>
+              <w:t>{qe_4_10_emissao}</w:t>
+            </w:r>
+            <w:r>
+              <w:t>{qe_4_10_validade}</w:t>
+            </w:r>
+            <w:r>
+              <w:t>{qe_4_10_status}</w:t>
+            </w:r>
           </w:p>
         </w:tc>
         <w:tc>
@@ -4794,6 +5178,18 @@
                 <w:szCs w:val="20"/>
               </w:rPr>
             </w:pPr>
+            <w:r>
+              <w:t>{or_6_5_codigo}</w:t>
+            </w:r>
+            <w:r>
+              <w:t>{or_6_5_emissao}</w:t>
+            </w:r>
+            <w:r>
+              <w:t>{or_6_5_validade}</w:t>
+            </w:r>
+            <w:r>
+              <w:t>{or_6_5_status}</w:t>
+            </w:r>
           </w:p>
         </w:tc>
         <w:tc>
@@ -6195,7 +6591,7 @@
 </w:document>
 </file>
 
-<file path=word/endnotes.xml><?xml version="1.0" encoding="utf-8"?>
+<file path=word\endnotes.xml><?xml version="1.0" encoding="utf-8"?>
 <w:endnotes xmlns:wpc="http://schemas.microsoft.com/office/word/2010/wordprocessingCanvas" xmlns:cx="http://schemas.microsoft.com/office/drawing/2014/chartex" xmlns:cx1="http://schemas.microsoft.com/office/drawing/2015/9/8/chartex" xmlns:cx2="http://schemas.microsoft.com/office/drawing/2015/10/21/chartex" xmlns:cx3="http://schemas.microsoft.com/office/drawing/2016/5/9/chartex" xmlns:cx4="http://schemas.microsoft.com/office/drawing/2016/5/10/chartex" xmlns:cx5="http://schemas.microsoft.com/office/drawing/2016/5/11/chartex" xmlns:cx6="http://schemas.microsoft.com/office/drawing/2016/5/12/chartex" xmlns:cx7="http://schemas.microsoft.com/office/drawing/2016/5/13/chartex" xmlns:cx8="http://schemas.microsoft.com/office/drawing/2016/5/14/chartex" xmlns:mc="http://schemas.openxmlformats.org/markup-compatibility/2006" xmlns:aink="http://schemas.microsoft.com/office/drawing/2016/ink" xmlns:am3d="http://schemas.microsoft.com/office/drawing/2017/model3d" xmlns:o="urn:schemas-microsoft-com:office:office" xmlns:oel="http://schemas.microsoft.com/office/2019/extlst" xmlns:r="http://schemas.openxmlformats.org/officeDocument/2006/relationships" xmlns:m="http://schemas.openxmlformats.org/officeDocument/2006/math" xmlns:v="urn:schemas-microsoft-com:vml" xmlns:wp14="http://schemas.microsoft.com/office/word/2010/wordprocessingDrawing" xmlns:wp="http://schemas.openxmlformats.org/drawingml/2006/wordprocessingDrawing" xmlns:w10="urn:schemas-microsoft-com:office:word" xmlns:w="http://schemas.openxmlformats.org/wordprocessingml/2006/main" xmlns:w14="http://schemas.microsoft.com/office/word/2010/wordml" xmlns:w15="http://schemas.microsoft.com/office/word/2012/wordml" xmlns:w16cex="http://schemas.microsoft.com/office/word/2018/wordml/cex" xmlns:w16cid="http://schemas.microsoft.com/office/word/2016/wordml/cid" xmlns:w16="http://schemas.microsoft.com/office/word/2018/wordml" xmlns:w16du="http://schemas.microsoft.com/office/word/2023/wordml/word16du" xmlns:w16sdtdh="http://schemas.microsoft.com/office/word/2020/wordml/sdtdatahash" xmlns:w16sdtfl="http://schemas.microsoft.com/office/word/2024/wordml/sdtformatlock" xmlns:w16se="http://schemas.microsoft.com/office/word/2015/wordml/symex" xmlns:wpg="http://schemas.microsoft.com/office/word/2010/wordprocessingGroup" xmlns:wpi="http://schemas.microsoft.com/office/word/2010/wordprocessingInk" xmlns:wne="http://schemas.microsoft.com/office/word/2006/wordml" xmlns:wps="http://schemas.microsoft.com/office/word/2010/wordprocessingShape" mc:Ignorable="w14 w15 w16se w16cid w16 w16cex w16sdtdh w16sdtfl w16du wp14">
   <w:endnote w:type="separator" w:id="-1">
     <w:p>
@@ -6220,7 +6616,45 @@
 </w:endnotes>
 </file>
 
-<file path=word/footer1.xml><?xml version="1.0" encoding="utf-8"?>
+<file path=word\fontTable.xml><?xml version="1.0" encoding="utf-8"?>
+<w:fonts xmlns:mc="http://schemas.openxmlformats.org/markup-compatibility/2006" xmlns:r="http://schemas.openxmlformats.org/officeDocument/2006/relationships" xmlns:w="http://schemas.openxmlformats.org/wordprocessingml/2006/main" xmlns:w14="http://schemas.microsoft.com/office/word/2010/wordml" xmlns:w15="http://schemas.microsoft.com/office/word/2012/wordml" xmlns:w16cex="http://schemas.microsoft.com/office/word/2018/wordml/cex" xmlns:w16cid="http://schemas.microsoft.com/office/word/2016/wordml/cid" xmlns:w16="http://schemas.microsoft.com/office/word/2018/wordml" xmlns:w16du="http://schemas.microsoft.com/office/word/2023/wordml/word16du" xmlns:w16sdtdh="http://schemas.microsoft.com/office/word/2020/wordml/sdtdatahash" xmlns:w16sdtfl="http://schemas.microsoft.com/office/word/2024/wordml/sdtformatlock" xmlns:w16se="http://schemas.microsoft.com/office/word/2015/wordml/symex" mc:Ignorable="w14 w15 w16se w16cid w16 w16cex w16sdtdh w16sdtfl w16du">
+  <w:font w:name="Times New Roman">
+    <w:panose1 w:val="02020603050405020304"/>
+    <w:charset w:val="00"/>
+    <w:family w:val="roman"/>
+    <w:pitch w:val="variable"/>
+    <w:sig w:usb0="E0002EFF" w:usb1="C000785B" w:usb2="00000009" w:usb3="00000000" w:csb0="000001FF" w:csb1="00000000"/>
+  </w:font>
+  <w:font w:name="Aptos">
+    <w:charset w:val="00"/>
+    <w:family w:val="swiss"/>
+    <w:pitch w:val="variable"/>
+    <w:sig w:usb0="20000287" w:usb1="00000003" w:usb2="00000000" w:usb3="00000000" w:csb0="0000019F" w:csb1="00000000"/>
+  </w:font>
+  <w:font w:name="Aptos Display">
+    <w:charset w:val="00"/>
+    <w:family w:val="swiss"/>
+    <w:pitch w:val="variable"/>
+    <w:sig w:usb0="20000287" w:usb1="00000003" w:usb2="00000000" w:usb3="00000000" w:csb0="0000019F" w:csb1="00000000"/>
+  </w:font>
+  <w:font w:name="Arial">
+    <w:panose1 w:val="020B0604020202020204"/>
+    <w:charset w:val="00"/>
+    <w:family w:val="swiss"/>
+    <w:pitch w:val="variable"/>
+    <w:sig w:usb0="E0002EFF" w:usb1="C000785B" w:usb2="00000009" w:usb3="00000000" w:csb0="000001FF" w:csb1="00000000"/>
+  </w:font>
+  <w:font w:name="Arial Narrow">
+    <w:panose1 w:val="020B0606020202030204"/>
+    <w:charset w:val="00"/>
+    <w:family w:val="swiss"/>
+    <w:pitch w:val="variable"/>
+    <w:sig w:usb0="00000287" w:usb1="00000800" w:usb2="00000000" w:usb3="00000000" w:csb0="0000009F" w:csb1="00000000"/>
+  </w:font>
+</w:fonts>
+</file>
+
+<file path=word\footer1.xml><?xml version="1.0" encoding="utf-8"?>
 <w:ftr xmlns:wpc="http://schemas.microsoft.com/office/word/2010/wordprocessingCanvas" xmlns:cx="http://schemas.microsoft.com/office/drawing/2014/chartex" xmlns:cx1="http://schemas.microsoft.com/office/drawing/2015/9/8/chartex" xmlns:cx2="http://schemas.microsoft.com/office/drawing/2015/10/21/chartex" xmlns:cx3="http://schemas.microsoft.com/office/drawing/2016/5/9/chartex" xmlns:cx4="http://schemas.microsoft.com/office/drawing/2016/5/10/chartex" xmlns:cx5="http://schemas.microsoft.com/office/drawing/2016/5/11/chartex" xmlns:cx6="http://schemas.microsoft.com/office/drawing/2016/5/12/chartex" xmlns:cx7="http://schemas.microsoft.com/office/drawing/2016/5/13/chartex" xmlns:cx8="http://schemas.microsoft.com/office/drawing/2016/5/14/chartex" xmlns:mc="http://schemas.openxmlformats.org/markup-compatibility/2006" xmlns:aink="http://schemas.microsoft.com/office/drawing/2016/ink" xmlns:am3d="http://schemas.microsoft.com/office/drawing/2017/model3d" xmlns:o="urn:schemas-microsoft-com:office:office" xmlns:oel="http://schemas.microsoft.com/office/2019/extlst" xmlns:r="http://schemas.openxmlformats.org/officeDocument/2006/relationships" xmlns:m="http://schemas.openxmlformats.org/officeDocument/2006/math" xmlns:v="urn:schemas-microsoft-com:vml" xmlns:wp14="http://schemas.microsoft.com/office/word/2010/wordprocessingDrawing" xmlns:wp="http://schemas.openxmlformats.org/drawingml/2006/wordprocessingDrawing" xmlns:w10="urn:schemas-microsoft-com:office:word" xmlns:w="http://schemas.openxmlformats.org/wordprocessingml/2006/main" xmlns:w14="http://schemas.microsoft.com/office/word/2010/wordml" xmlns:w15="http://schemas.microsoft.com/office/word/2012/wordml" xmlns:w16cex="http://schemas.microsoft.com/office/word/2018/wordml/cex" xmlns:w16cid="http://schemas.microsoft.com/office/word/2016/wordml/cid" xmlns:w16="http://schemas.microsoft.com/office/word/2018/wordml" xmlns:w16du="http://schemas.microsoft.com/office/word/2023/wordml/word16du" xmlns:w16sdtdh="http://schemas.microsoft.com/office/word/2020/wordml/sdtdatahash" xmlns:w16sdtfl="http://schemas.microsoft.com/office/word/2024/wordml/sdtformatlock" xmlns:w16se="http://schemas.microsoft.com/office/word/2015/wordml/symex" xmlns:wpg="http://schemas.microsoft.com/office/word/2010/wordprocessingGroup" xmlns:wpi="http://schemas.microsoft.com/office/word/2010/wordprocessingInk" xmlns:wne="http://schemas.microsoft.com/office/word/2006/wordml" xmlns:wps="http://schemas.microsoft.com/office/word/2010/wordprocessingShape" mc:Ignorable="w14 w15 w16se w16cid w16 w16cex w16sdtdh w16sdtfl w16du wp14">
   <w:p>
     <w:pPr>
@@ -6305,7 +6739,7 @@
 </w:ftr>
 </file>
 
-<file path=word/footnotes.xml><?xml version="1.0" encoding="utf-8"?>
+<file path=word\footnotes.xml><?xml version="1.0" encoding="utf-8"?>
 <w:footnotes xmlns:wpc="http://schemas.microsoft.com/office/word/2010/wordprocessingCanvas" xmlns:cx="http://schemas.microsoft.com/office/drawing/2014/chartex" xmlns:cx1="http://schemas.microsoft.com/office/drawing/2015/9/8/chartex" xmlns:cx2="http://schemas.microsoft.com/office/drawing/2015/10/21/chartex" xmlns:cx3="http://schemas.microsoft.com/office/drawing/2016/5/9/chartex" xmlns:cx4="http://schemas.microsoft.com/office/drawing/2016/5/10/chartex" xmlns:cx5="http://schemas.microsoft.com/office/drawing/2016/5/11/chartex" xmlns:cx6="http://schemas.microsoft.com/office/drawing/2016/5/12/chartex" xmlns:cx7="http://schemas.microsoft.com/office/drawing/2016/5/13/chartex" xmlns:cx8="http://schemas.microsoft.com/office/drawing/2016/5/14/chartex" xmlns:mc="http://schemas.openxmlformats.org/markup-compatibility/2006" xmlns:aink="http://schemas.microsoft.com/office/drawing/2016/ink" xmlns:am3d="http://schemas.microsoft.com/office/drawing/2017/model3d" xmlns:o="urn:schemas-microsoft-com:office:office" xmlns:oel="http://schemas.microsoft.com/office/2019/extlst" xmlns:r="http://schemas.openxmlformats.org/officeDocument/2006/relationships" xmlns:m="http://schemas.openxmlformats.org/officeDocument/2006/math" xmlns:v="urn:schemas-microsoft-com:vml" xmlns:wp14="http://schemas.microsoft.com/office/word/2010/wordprocessingDrawing" xmlns:wp="http://schemas.openxmlformats.org/drawingml/2006/wordprocessingDrawing" xmlns:w10="urn:schemas-microsoft-com:office:word" xmlns:w="http://schemas.openxmlformats.org/wordprocessingml/2006/main" xmlns:w14="http://schemas.microsoft.com/office/word/2010/wordml" xmlns:w15="http://schemas.microsoft.com/office/word/2012/wordml" xmlns:w16cex="http://schemas.microsoft.com/office/word/2018/wordml/cex" xmlns:w16cid="http://schemas.microsoft.com/office/word/2016/wordml/cid" xmlns:w16="http://schemas.microsoft.com/office/word/2018/wordml" xmlns:w16du="http://schemas.microsoft.com/office/word/2023/wordml/word16du" xmlns:w16sdtdh="http://schemas.microsoft.com/office/word/2020/wordml/sdtdatahash" xmlns:w16sdtfl="http://schemas.microsoft.com/office/word/2024/wordml/sdtformatlock" xmlns:w16se="http://schemas.microsoft.com/office/word/2015/wordml/symex" xmlns:wpg="http://schemas.microsoft.com/office/word/2010/wordprocessingGroup" xmlns:wpi="http://schemas.microsoft.com/office/word/2010/wordprocessingInk" xmlns:wne="http://schemas.microsoft.com/office/word/2006/wordml" xmlns:wps="http://schemas.microsoft.com/office/word/2010/wordprocessingShape" mc:Ignorable="w14 w15 w16se w16cid w16 w16cex w16sdtdh w16sdtfl w16du wp14">
   <w:footnote w:type="separator" w:id="-1">
     <w:p>
@@ -6330,7 +6764,7 @@
 </w:footnotes>
 </file>
 
-<file path=word/header1.xml><?xml version="1.0" encoding="utf-8"?>
+<file path=word\header1.xml><?xml version="1.0" encoding="utf-8"?>
 <w:hdr xmlns:wpc="http://schemas.microsoft.com/office/word/2010/wordprocessingCanvas" xmlns:cx="http://schemas.microsoft.com/office/drawing/2014/chartex" xmlns:cx1="http://schemas.microsoft.com/office/drawing/2015/9/8/chartex" xmlns:cx2="http://schemas.microsoft.com/office/drawing/2015/10/21/chartex" xmlns:cx3="http://schemas.microsoft.com/office/drawing/2016/5/9/chartex" xmlns:cx4="http://schemas.microsoft.com/office/drawing/2016/5/10/chartex" xmlns:cx5="http://schemas.microsoft.com/office/drawing/2016/5/11/chartex" xmlns:cx6="http://schemas.microsoft.com/office/drawing/2016/5/12/chartex" xmlns:cx7="http://schemas.microsoft.com/office/drawing/2016/5/13/chartex" xmlns:cx8="http://schemas.microsoft.com/office/drawing/2016/5/14/chartex" xmlns:mc="http://schemas.openxmlformats.org/markup-compatibility/2006" xmlns:aink="http://schemas.microsoft.com/office/drawing/2016/ink" xmlns:am3d="http://schemas.microsoft.com/office/drawing/2017/model3d" xmlns:o="urn:schemas-microsoft-com:office:office" xmlns:oel="http://schemas.microsoft.com/office/2019/extlst" xmlns:r="http://schemas.openxmlformats.org/officeDocument/2006/relationships" xmlns:m="http://schemas.openxmlformats.org/officeDocument/2006/math" xmlns:v="urn:schemas-microsoft-com:vml" xmlns:wp14="http://schemas.microsoft.com/office/word/2010/wordprocessingDrawing" xmlns:wp="http://schemas.openxmlformats.org/drawingml/2006/wordprocessingDrawing" xmlns:w10="urn:schemas-microsoft-com:office:word" xmlns:w="http://schemas.openxmlformats.org/wordprocessingml/2006/main" xmlns:w14="http://schemas.microsoft.com/office/word/2010/wordml" xmlns:w15="http://schemas.microsoft.com/office/word/2012/wordml" xmlns:w16cex="http://schemas.microsoft.com/office/word/2018/wordml/cex" xmlns:w16cid="http://schemas.microsoft.com/office/word/2016/wordml/cid" xmlns:w16="http://schemas.microsoft.com/office/word/2018/wordml" xmlns:w16du="http://schemas.microsoft.com/office/word/2023/wordml/word16du" xmlns:w16sdtdh="http://schemas.microsoft.com/office/word/2020/wordml/sdtdatahash" xmlns:w16sdtfl="http://schemas.microsoft.com/office/word/2024/wordml/sdtformatlock" xmlns:w16se="http://schemas.microsoft.com/office/word/2015/wordml/symex" xmlns:wpg="http://schemas.microsoft.com/office/word/2010/wordprocessingGroup" xmlns:wpi="http://schemas.microsoft.com/office/word/2010/wordprocessingInk" xmlns:wne="http://schemas.microsoft.com/office/word/2006/wordml" xmlns:wps="http://schemas.microsoft.com/office/word/2010/wordprocessingShape" mc:Ignorable="w14 w15 w16se w16cid w16 w16cex w16sdtdh w16sdtfl w16du wp14">
   <w:p>
     <w:pPr>
@@ -6370,7 +6804,7 @@
 </w:hdr>
 </file>
 
-<file path=word/header2.xml><?xml version="1.0" encoding="utf-8"?>
+<file path=word\header2.xml><?xml version="1.0" encoding="utf-8"?>
 <w:hdr xmlns:wpc="http://schemas.microsoft.com/office/word/2010/wordprocessingCanvas" xmlns:cx="http://schemas.microsoft.com/office/drawing/2014/chartex" xmlns:cx1="http://schemas.microsoft.com/office/drawing/2015/9/8/chartex" xmlns:cx2="http://schemas.microsoft.com/office/drawing/2015/10/21/chartex" xmlns:cx3="http://schemas.microsoft.com/office/drawing/2016/5/9/chartex" xmlns:cx4="http://schemas.microsoft.com/office/drawing/2016/5/10/chartex" xmlns:cx5="http://schemas.microsoft.com/office/drawing/2016/5/11/chartex" xmlns:cx6="http://schemas.microsoft.com/office/drawing/2016/5/12/chartex" xmlns:cx7="http://schemas.microsoft.com/office/drawing/2016/5/13/chartex" xmlns:cx8="http://schemas.microsoft.com/office/drawing/2016/5/14/chartex" xmlns:mc="http://schemas.openxmlformats.org/markup-compatibility/2006" xmlns:aink="http://schemas.microsoft.com/office/drawing/2016/ink" xmlns:am3d="http://schemas.microsoft.com/office/drawing/2017/model3d" xmlns:o="urn:schemas-microsoft-com:office:office" xmlns:oel="http://schemas.microsoft.com/office/2019/extlst" xmlns:r="http://schemas.openxmlformats.org/officeDocument/2006/relationships" xmlns:m="http://schemas.openxmlformats.org/officeDocument/2006/math" xmlns:v="urn:schemas-microsoft-com:vml" xmlns:wp14="http://schemas.microsoft.com/office/word/2010/wordprocessingDrawing" xmlns:wp="http://schemas.openxmlformats.org/drawingml/2006/wordprocessingDrawing" xmlns:w10="urn:schemas-microsoft-com:office:word" xmlns:w="http://schemas.openxmlformats.org/wordprocessingml/2006/main" xmlns:w14="http://schemas.microsoft.com/office/word/2010/wordml" xmlns:w15="http://schemas.microsoft.com/office/word/2012/wordml" xmlns:w16cex="http://schemas.microsoft.com/office/word/2018/wordml/cex" xmlns:w16cid="http://schemas.microsoft.com/office/word/2016/wordml/cid" xmlns:w16="http://schemas.microsoft.com/office/word/2018/wordml" xmlns:w16du="http://schemas.microsoft.com/office/word/2023/wordml/word16du" xmlns:w16sdtdh="http://schemas.microsoft.com/office/word/2020/wordml/sdtdatahash" xmlns:w16sdtfl="http://schemas.microsoft.com/office/word/2024/wordml/sdtformatlock" xmlns:w16se="http://schemas.microsoft.com/office/word/2015/wordml/symex" xmlns:wpg="http://schemas.microsoft.com/office/word/2010/wordprocessingGroup" xmlns:wpi="http://schemas.microsoft.com/office/word/2010/wordprocessingInk" xmlns:wne="http://schemas.microsoft.com/office/word/2006/wordml" xmlns:wps="http://schemas.microsoft.com/office/word/2010/wordprocessingShape" mc:Ignorable="w14 w15 w16se w16cid w16 w16cex w16sdtdh w16sdtfl w16du wp14">
   <w:p>
     <w:pPr>
@@ -6457,7 +6891,7 @@
 </w:hdr>
 </file>
 
-<file path=word/header3.xml><?xml version="1.0" encoding="utf-8"?>
+<file path=word\header3.xml><?xml version="1.0" encoding="utf-8"?>
 <w:hdr xmlns:wpc="http://schemas.microsoft.com/office/word/2010/wordprocessingCanvas" xmlns:cx="http://schemas.microsoft.com/office/drawing/2014/chartex" xmlns:cx1="http://schemas.microsoft.com/office/drawing/2015/9/8/chartex" xmlns:cx2="http://schemas.microsoft.com/office/drawing/2015/10/21/chartex" xmlns:cx3="http://schemas.microsoft.com/office/drawing/2016/5/9/chartex" xmlns:cx4="http://schemas.microsoft.com/office/drawing/2016/5/10/chartex" xmlns:cx5="http://schemas.microsoft.com/office/drawing/2016/5/11/chartex" xmlns:cx6="http://schemas.microsoft.com/office/drawing/2016/5/12/chartex" xmlns:cx7="http://schemas.microsoft.com/office/drawing/2016/5/13/chartex" xmlns:cx8="http://schemas.microsoft.com/office/drawing/2016/5/14/chartex" xmlns:mc="http://schemas.openxmlformats.org/markup-compatibility/2006" xmlns:aink="http://schemas.microsoft.com/office/drawing/2016/ink" xmlns:am3d="http://schemas.microsoft.com/office/drawing/2017/model3d" xmlns:o="urn:schemas-microsoft-com:office:office" xmlns:oel="http://schemas.microsoft.com/office/2019/extlst" xmlns:r="http://schemas.openxmlformats.org/officeDocument/2006/relationships" xmlns:m="http://schemas.openxmlformats.org/officeDocument/2006/math" xmlns:v="urn:schemas-microsoft-com:vml" xmlns:wp14="http://schemas.microsoft.com/office/word/2010/wordprocessingDrawing" xmlns:wp="http://schemas.openxmlformats.org/drawingml/2006/wordprocessingDrawing" xmlns:w10="urn:schemas-microsoft-com:office:word" xmlns:w="http://schemas.openxmlformats.org/wordprocessingml/2006/main" xmlns:w14="http://schemas.microsoft.com/office/word/2010/wordml" xmlns:w15="http://schemas.microsoft.com/office/word/2012/wordml" xmlns:w16cex="http://schemas.microsoft.com/office/word/2018/wordml/cex" xmlns:w16cid="http://schemas.microsoft.com/office/word/2016/wordml/cid" xmlns:w16="http://schemas.microsoft.com/office/word/2018/wordml" xmlns:w16du="http://schemas.microsoft.com/office/word/2023/wordml/word16du" xmlns:w16sdtdh="http://schemas.microsoft.com/office/word/2020/wordml/sdtdatahash" xmlns:w16sdtfl="http://schemas.microsoft.com/office/word/2024/wordml/sdtformatlock" xmlns:w16se="http://schemas.microsoft.com/office/word/2015/wordml/symex" xmlns:wpg="http://schemas.microsoft.com/office/word/2010/wordprocessingGroup" xmlns:wpi="http://schemas.microsoft.com/office/word/2010/wordprocessingInk" xmlns:wne="http://schemas.microsoft.com/office/word/2006/wordml" xmlns:wps="http://schemas.microsoft.com/office/word/2010/wordprocessingShape" mc:Ignorable="w14 w15 w16se w16cid w16 w16cex w16sdtdh w16sdtfl w16du wp14">
   <w:p>
     <w:pPr>
@@ -6497,7 +6931,7 @@
 </w:hdr>
 </file>
 
-<file path=word/numbering.xml><?xml version="1.0" encoding="utf-8"?>
+<file path=word\numbering.xml><?xml version="1.0" encoding="utf-8"?>
 <w:numbering xmlns:wpc="http://schemas.microsoft.com/office/word/2010/wordprocessingCanvas" xmlns:cx="http://schemas.microsoft.com/office/drawing/2014/chartex" xmlns:cx1="http://schemas.microsoft.com/office/drawing/2015/9/8/chartex" xmlns:cx2="http://schemas.microsoft.com/office/drawing/2015/10/21/chartex" xmlns:cx3="http://schemas.microsoft.com/office/drawing/2016/5/9/chartex" xmlns:cx4="http://schemas.microsoft.com/office/drawing/2016/5/10/chartex" xmlns:cx5="http://schemas.microsoft.com/office/drawing/2016/5/11/chartex" xmlns:cx6="http://schemas.microsoft.com/office/drawing/2016/5/12/chartex" xmlns:cx7="http://schemas.microsoft.com/office/drawing/2016/5/13/chartex" xmlns:cx8="http://schemas.microsoft.com/office/drawing/2016/5/14/chartex" xmlns:mc="http://schemas.openxmlformats.org/markup-compatibility/2006" xmlns:aink="http://schemas.microsoft.com/office/drawing/2016/ink" xmlns:am3d="http://schemas.microsoft.com/office/drawing/2017/model3d" xmlns:o="urn:schemas-microsoft-com:office:office" xmlns:oel="http://schemas.microsoft.com/office/2019/extlst" xmlns:r="http://schemas.openxmlformats.org/officeDocument/2006/relationships" xmlns:m="http://schemas.openxmlformats.org/officeDocument/2006/math" xmlns:v="urn:schemas-microsoft-com:vml" xmlns:wp14="http://schemas.microsoft.com/office/word/2010/wordprocessingDrawing" xmlns:wp="http://schemas.openxmlformats.org/drawingml/2006/wordprocessingDrawing" xmlns:w10="urn:schemas-microsoft-com:office:word" xmlns:w="http://schemas.openxmlformats.org/wordprocessingml/2006/main" xmlns:w14="http://schemas.microsoft.com/office/word/2010/wordml" xmlns:w15="http://schemas.microsoft.com/office/word/2012/wordml" xmlns:w16cex="http://schemas.microsoft.com/office/word/2018/wordml/cex" xmlns:w16cid="http://schemas.microsoft.com/office/word/2016/wordml/cid" xmlns:w16="http://schemas.microsoft.com/office/word/2018/wordml" xmlns:w16du="http://schemas.microsoft.com/office/word/2023/wordml/word16du" xmlns:w16sdtdh="http://schemas.microsoft.com/office/word/2020/wordml/sdtdatahash" xmlns:w16sdtfl="http://schemas.microsoft.com/office/word/2024/wordml/sdtformatlock" xmlns:w16se="http://schemas.microsoft.com/office/word/2015/wordml/symex" xmlns:wpg="http://schemas.microsoft.com/office/word/2010/wordprocessingGroup" xmlns:wpi="http://schemas.microsoft.com/office/word/2010/wordprocessingInk" xmlns:wne="http://schemas.microsoft.com/office/word/2006/wordml" xmlns:wps="http://schemas.microsoft.com/office/word/2010/wordprocessingShape" mc:Ignorable="w14 w15 w16se w16cid w16 w16cex w16sdtdh w16sdtfl w16du wp14">
   <w:abstractNum w:abstractNumId="0" w15:restartNumberingAfterBreak="0">
     <w:nsid w:val="19FA3A4F"/>
@@ -6958,7 +7392,170 @@
 </w:numbering>
 </file>
 
-<file path=word/styles.xml><?xml version="1.0" encoding="utf-8"?>
+<file path=word\settings.xml><?xml version="1.0" encoding="utf-8"?>
+<w:settings xmlns:mc="http://schemas.openxmlformats.org/markup-compatibility/2006" xmlns:o="urn:schemas-microsoft-com:office:office" xmlns:r="http://schemas.openxmlformats.org/officeDocument/2006/relationships" xmlns:m="http://schemas.openxmlformats.org/officeDocument/2006/math" xmlns:v="urn:schemas-microsoft-com:vml" xmlns:w10="urn:schemas-microsoft-com:office:word" xmlns:w="http://schemas.openxmlformats.org/wordprocessingml/2006/main" xmlns:w14="http://schemas.microsoft.com/office/word/2010/wordml" xmlns:w15="http://schemas.microsoft.com/office/word/2012/wordml" xmlns:w16cex="http://schemas.microsoft.com/office/word/2018/wordml/cex" xmlns:w16cid="http://schemas.microsoft.com/office/word/2016/wordml/cid" xmlns:w16="http://schemas.microsoft.com/office/word/2018/wordml" xmlns:w16du="http://schemas.microsoft.com/office/word/2023/wordml/word16du" xmlns:w16sdtdh="http://schemas.microsoft.com/office/word/2020/wordml/sdtdatahash" xmlns:w16sdtfl="http://schemas.microsoft.com/office/word/2024/wordml/sdtformatlock" xmlns:w16se="http://schemas.microsoft.com/office/word/2015/wordml/symex" xmlns:sl="http://schemas.openxmlformats.org/schemaLibrary/2006/main" mc:Ignorable="w14 w15 w16se w16cid w16 w16cex w16sdtdh w16sdtfl w16du">
+  <w:zoom w:percent="120"/>
+  <w:defaultTabStop w:val="708"/>
+  <w:hyphenationZone w:val="425"/>
+  <w:characterSpacingControl w:val="doNotCompress"/>
+  <w:hdrShapeDefaults>
+    <o:shapedefaults v:ext="edit" spidmax="2050"/>
+    <o:shapelayout v:ext="edit">
+      <o:idmap v:ext="edit" data="1"/>
+    </o:shapelayout>
+  </w:hdrShapeDefaults>
+  <w:footnotePr>
+    <w:footnote w:id="-1"/>
+    <w:footnote w:id="0"/>
+  </w:footnotePr>
+  <w:endnotePr>
+    <w:endnote w:id="-1"/>
+    <w:endnote w:id="0"/>
+  </w:endnotePr>
+  <w:compat>
+    <w:compatSetting w:name="compatibilityMode" w:uri="http://schemas.microsoft.com/office/word" w:val="15"/>
+    <w:compatSetting w:name="overrideTableStyleFontSizeAndJustification" w:uri="http://schemas.microsoft.com/office/word" w:val="1"/>
+    <w:compatSetting w:name="enableOpenTypeFeatures" w:uri="http://schemas.microsoft.com/office/word" w:val="1"/>
+    <w:compatSetting w:name="doNotFlipMirrorIndents" w:uri="http://schemas.microsoft.com/office/word" w:val="1"/>
+    <w:compatSetting w:name="differentiateMultirowTableHeaders" w:uri="http://schemas.microsoft.com/office/word" w:val="1"/>
+    <w:compatSetting w:name="useWord2013TrackBottomHyphenation" w:uri="http://schemas.microsoft.com/office/word" w:val="0"/>
+  </w:compat>
+  <w:rsids>
+    <w:rsidRoot w:val="00CF5CF2"/>
+    <w:rsid w:val="000147E5"/>
+    <w:rsid w:val="00025BF5"/>
+    <w:rsid w:val="000721F2"/>
+    <w:rsid w:val="000759EC"/>
+    <w:rsid w:val="00085434"/>
+    <w:rsid w:val="000907A8"/>
+    <w:rsid w:val="00091A3B"/>
+    <w:rsid w:val="000C0A80"/>
+    <w:rsid w:val="000C79D8"/>
+    <w:rsid w:val="001346AF"/>
+    <w:rsid w:val="00136B54"/>
+    <w:rsid w:val="00152F5C"/>
+    <w:rsid w:val="001939E4"/>
+    <w:rsid w:val="001B5153"/>
+    <w:rsid w:val="001C201A"/>
+    <w:rsid w:val="001E1749"/>
+    <w:rsid w:val="001F18EA"/>
+    <w:rsid w:val="001F2A49"/>
+    <w:rsid w:val="00220DBF"/>
+    <w:rsid w:val="002309D4"/>
+    <w:rsid w:val="002530F1"/>
+    <w:rsid w:val="002571D0"/>
+    <w:rsid w:val="00261548"/>
+    <w:rsid w:val="002658A5"/>
+    <w:rsid w:val="002740BB"/>
+    <w:rsid w:val="002B6C94"/>
+    <w:rsid w:val="002C31D0"/>
+    <w:rsid w:val="00321A31"/>
+    <w:rsid w:val="00347351"/>
+    <w:rsid w:val="003F1BD7"/>
+    <w:rsid w:val="0040159A"/>
+    <w:rsid w:val="0043749E"/>
+    <w:rsid w:val="00442875"/>
+    <w:rsid w:val="004703C5"/>
+    <w:rsid w:val="004947A4"/>
+    <w:rsid w:val="004B779F"/>
+    <w:rsid w:val="004C34E6"/>
+    <w:rsid w:val="004D47EB"/>
+    <w:rsid w:val="0051283F"/>
+    <w:rsid w:val="00522E17"/>
+    <w:rsid w:val="00564C56"/>
+    <w:rsid w:val="00593604"/>
+    <w:rsid w:val="005B4555"/>
+    <w:rsid w:val="005E6736"/>
+    <w:rsid w:val="006E2850"/>
+    <w:rsid w:val="006F28AA"/>
+    <w:rsid w:val="006F4D5F"/>
+    <w:rsid w:val="00717903"/>
+    <w:rsid w:val="0072140D"/>
+    <w:rsid w:val="00724A46"/>
+    <w:rsid w:val="007666A4"/>
+    <w:rsid w:val="007F0BF0"/>
+    <w:rsid w:val="0084493E"/>
+    <w:rsid w:val="008703FA"/>
+    <w:rsid w:val="008826DF"/>
+    <w:rsid w:val="009B232A"/>
+    <w:rsid w:val="009B567A"/>
+    <w:rsid w:val="009C668D"/>
+    <w:rsid w:val="009D2AA6"/>
+    <w:rsid w:val="00A357FB"/>
+    <w:rsid w:val="00A473EA"/>
+    <w:rsid w:val="00AA6A20"/>
+    <w:rsid w:val="00AF7644"/>
+    <w:rsid w:val="00B76EEF"/>
+    <w:rsid w:val="00B958ED"/>
+    <w:rsid w:val="00BB3CFA"/>
+    <w:rsid w:val="00BD55CA"/>
+    <w:rsid w:val="00BD71E8"/>
+    <w:rsid w:val="00BE0EF4"/>
+    <w:rsid w:val="00BE1A03"/>
+    <w:rsid w:val="00BE3645"/>
+    <w:rsid w:val="00BF6B73"/>
+    <w:rsid w:val="00BF78C0"/>
+    <w:rsid w:val="00C04E4E"/>
+    <w:rsid w:val="00C55A36"/>
+    <w:rsid w:val="00C81ACA"/>
+    <w:rsid w:val="00C9436F"/>
+    <w:rsid w:val="00CA69F1"/>
+    <w:rsid w:val="00CC1C0C"/>
+    <w:rsid w:val="00CD0796"/>
+    <w:rsid w:val="00CD07D4"/>
+    <w:rsid w:val="00CF07B3"/>
+    <w:rsid w:val="00CF5CF2"/>
+    <w:rsid w:val="00DA4394"/>
+    <w:rsid w:val="00DE5DE6"/>
+    <w:rsid w:val="00E01A44"/>
+    <w:rsid w:val="00E02E7E"/>
+    <w:rsid w:val="00E078BD"/>
+    <w:rsid w:val="00E517B7"/>
+    <w:rsid w:val="00E576B3"/>
+    <w:rsid w:val="00E71F4D"/>
+    <w:rsid w:val="00E90A4D"/>
+    <w:rsid w:val="00EE37D9"/>
+    <w:rsid w:val="00EF6757"/>
+    <w:rsid w:val="00F24228"/>
+    <w:rsid w:val="00F55A37"/>
+    <w:rsid w:val="00F84956"/>
+    <w:rsid w:val="00F91181"/>
+    <w:rsid w:val="00FB0AE2"/>
+    <w:rsid w:val="00FB1A7E"/>
+    <w:rsid w:val="00FD5C41"/>
+    <w:rsid w:val="00FF2158"/>
+    <w:rsid w:val="00FF31A8"/>
+  </w:rsids>
+  <m:mathPr>
+    <m:mathFont m:val="Cambria Math"/>
+    <m:brkBin m:val="before"/>
+    <m:brkBinSub m:val="--"/>
+    <m:smallFrac m:val="0"/>
+    <m:dispDef/>
+    <m:lMargin m:val="0"/>
+    <m:rMargin m:val="0"/>
+    <m:defJc m:val="centerGroup"/>
+    <m:wrapIndent m:val="1440"/>
+    <m:intLim m:val="subSup"/>
+    <m:naryLim m:val="undOvr"/>
+  </m:mathPr>
+  <w:themeFontLang w:val="pt-BR"/>
+  <w:clrSchemeMapping w:bg1="light1" w:t1="dark1" w:bg2="light2" w:t2="dark2" w:accent1="accent1" w:accent2="accent2" w:accent3="accent3" w:accent4="accent4" w:accent5="accent5" w:accent6="accent6" w:hyperlink="hyperlink" w:followedHyperlink="followedHyperlink"/>
+  <w:shapeDefaults>
+    <o:shapedefaults v:ext="edit" spidmax="2050"/>
+    <o:shapelayout v:ext="edit">
+      <o:idmap v:ext="edit" data="2"/>
+    </o:shapelayout>
+  </w:shapeDefaults>
+  <w:decimalSymbol w:val=","/>
+  <w:listSeparator w:val=";"/>
+  <w14:docId w14:val="5BC84B6A"/>
+  <w15:chartTrackingRefBased/>
+  <w15:docId w15:val="{22371856-A803-4045-95C2-2BC7A11F5836}"/>
+</w:settings>
+</file>
+
+<file path=word\styles.xml><?xml version="1.0" encoding="utf-8"?>
 <w:styles xmlns:mc="http://schemas.openxmlformats.org/markup-compatibility/2006" xmlns:r="http://schemas.openxmlformats.org/officeDocument/2006/relationships" xmlns:w="http://schemas.openxmlformats.org/wordprocessingml/2006/main" xmlns:w14="http://schemas.microsoft.com/office/word/2010/wordml" xmlns:w15="http://schemas.microsoft.com/office/word/2012/wordml" xmlns:w16cex="http://schemas.microsoft.com/office/word/2018/wordml/cex" xmlns:w16cid="http://schemas.microsoft.com/office/word/2016/wordml/cid" xmlns:w16="http://schemas.microsoft.com/office/word/2018/wordml" xmlns:w16du="http://schemas.microsoft.com/office/word/2023/wordml/word16du" xmlns:w16sdtdh="http://schemas.microsoft.com/office/word/2020/wordml/sdtdatahash" xmlns:w16sdtfl="http://schemas.microsoft.com/office/word/2024/wordml/sdtformatlock" xmlns:w16se="http://schemas.microsoft.com/office/word/2015/wordml/symex" mc:Ignorable="w14 w15 w16se w16cid w16 w16cex w16sdtdh w16sdtfl w16du">
   <w:docDefaults>
     <w:rPrDefault>
@@ -8016,7 +8613,7 @@
 </w:styles>
 </file>
 
-<file path=word/theme/theme1.xml><?xml version="1.0" encoding="utf-8"?>
+<file path=word\theme\theme1.xml><?xml version="1.0" encoding="utf-8"?>
 <a:theme xmlns:a="http://schemas.openxmlformats.org/drawingml/2006/main" name="Tema do Office">
   <a:themeElements>
     <a:clrScheme name="Office">
@@ -8329,4 +8926,11 @@
     </a:ext>
   </a:extLst>
 </a:theme>
+</file>
+
+<file path=word\webSettings.xml><?xml version="1.0" encoding="utf-8"?>
+<w:webSettings xmlns:mc="http://schemas.openxmlformats.org/markup-compatibility/2006" xmlns:r="http://schemas.openxmlformats.org/officeDocument/2006/relationships" xmlns:w="http://schemas.openxmlformats.org/wordprocessingml/2006/main" xmlns:w14="http://schemas.microsoft.com/office/word/2010/wordml" xmlns:w15="http://schemas.microsoft.com/office/word/2012/wordml" xmlns:w16cex="http://schemas.microsoft.com/office/word/2018/wordml/cex" xmlns:w16cid="http://schemas.microsoft.com/office/word/2016/wordml/cid" xmlns:w16="http://schemas.microsoft.com/office/word/2018/wordml" xmlns:w16du="http://schemas.microsoft.com/office/word/2023/wordml/word16du" xmlns:w16sdtdh="http://schemas.microsoft.com/office/word/2020/wordml/sdtdatahash" xmlns:w16sdtfl="http://schemas.microsoft.com/office/word/2024/wordml/sdtformatlock" xmlns:w16se="http://schemas.microsoft.com/office/word/2015/wordml/symex" mc:Ignorable="w14 w15 w16se w16cid w16 w16cex w16sdtdh w16sdtfl w16du">
+  <w:optimizeForBrowser/>
+  <w:allowPNG/>
+</w:webSettings>
 </file>
</xml_diff>

<commit_message>
. Correção da Geração de Relatório .DOCX 2
</commit_message>
<xml_diff>
--- a/public/docs/MODEL_RELATORIO_CONFORMIDADE_OSC_REV00_20.04.2026_.docx
+++ b/public/docs/MODEL_RELATORIO_CONFORMIDADE_OSC_REV00_20.04.2026_.docx
@@ -1,56 +1,5 @@
 
-<file path=docProps\app.xml><?xml version="1.0" encoding="utf-8"?>
-<Properties xmlns="http://schemas.openxmlformats.org/officeDocument/2006/extended-properties" xmlns:vt="http://schemas.openxmlformats.org/officeDocument/2006/docPropsVTypes">
-  <Template>Normal.dotm</Template>
-  <TotalTime>9</TotalTime>
-  <Pages>3</Pages>
-  <Words>560</Words>
-  <Characters>3030</Characters>
-  <Application>Microsoft Office Word</Application>
-  <DocSecurity>0</DocSecurity>
-  <Lines>25</Lines>
-  <Paragraphs>7</Paragraphs>
-  <ScaleCrop>false</ScaleCrop>
-  <HeadingPairs>
-    <vt:vector size="2" baseType="variant">
-      <vt:variant>
-        <vt:lpstr>Título</vt:lpstr>
-      </vt:variant>
-      <vt:variant>
-        <vt:i4>1</vt:i4>
-      </vt:variant>
-    </vt:vector>
-  </HeadingPairs>
-  <TitlesOfParts>
-    <vt:vector size="1" baseType="lpstr">
-      <vt:lpstr/>
-    </vt:vector>
-  </TitlesOfParts>
-  <Company/>
-  <LinksUpToDate>false</LinksUpToDate>
-  <CharactersWithSpaces>3583</CharactersWithSpaces>
-  <SharedDoc>false</SharedDoc>
-  <HyperlinksChanged>false</HyperlinksChanged>
-  <AppVersion>16.0000</AppVersion>
-</Properties>
-</file>
-
-<file path=docProps\core.xml><?xml version="1.0" encoding="utf-8"?>
-<cp:coreProperties xmlns:cp="http://schemas.openxmlformats.org/package/2006/metadata/core-properties" xmlns:dc="http://purl.org/dc/elements/1.1/" xmlns:dcterms="http://purl.org/dc/terms/" xmlns:dcmitype="http://purl.org/dc/dcmitype/" xmlns:xsi="http://www.w3.org/2001/XMLSchema-instance">
-  <dc:title/>
-  <dc:subject/>
-  <dc:creator>Carlos Coelho</dc:creator>
-  <cp:keywords/>
-  <dc:description/>
-  <cp:lastModifiedBy>Carlos Coelho</cp:lastModifiedBy>
-  <cp:revision>8</cp:revision>
-  <cp:lastPrinted>2026-04-18T21:12:00Z</cp:lastPrinted>
-  <dcterms:created xsi:type="dcterms:W3CDTF">2026-04-20T22:55:00Z</dcterms:created>
-  <dcterms:modified xsi:type="dcterms:W3CDTF">2026-04-20T23:12:00Z</dcterms:modified>
-</cp:coreProperties>
-</file>
-
-<file path=word\document.xml><?xml version="1.0" encoding="utf-8"?>
+<file path=word/document.xml><?xml version="1.0" encoding="utf-8"?>
 <w:document xmlns:wpc="http://schemas.microsoft.com/office/word/2010/wordprocessingCanvas" xmlns:cx="http://schemas.microsoft.com/office/drawing/2014/chartex" xmlns:cx1="http://schemas.microsoft.com/office/drawing/2015/9/8/chartex" xmlns:cx2="http://schemas.microsoft.com/office/drawing/2015/10/21/chartex" xmlns:cx3="http://schemas.microsoft.com/office/drawing/2016/5/9/chartex" xmlns:cx4="http://schemas.microsoft.com/office/drawing/2016/5/10/chartex" xmlns:cx5="http://schemas.microsoft.com/office/drawing/2016/5/11/chartex" xmlns:cx6="http://schemas.microsoft.com/office/drawing/2016/5/12/chartex" xmlns:cx7="http://schemas.microsoft.com/office/drawing/2016/5/13/chartex" xmlns:cx8="http://schemas.microsoft.com/office/drawing/2016/5/14/chartex" xmlns:mc="http://schemas.openxmlformats.org/markup-compatibility/2006" xmlns:aink="http://schemas.microsoft.com/office/drawing/2016/ink" xmlns:am3d="http://schemas.microsoft.com/office/drawing/2017/model3d" xmlns:o="urn:schemas-microsoft-com:office:office" xmlns:oel="http://schemas.microsoft.com/office/2019/extlst" xmlns:r="http://schemas.openxmlformats.org/officeDocument/2006/relationships" xmlns:m="http://schemas.openxmlformats.org/officeDocument/2006/math" xmlns:v="urn:schemas-microsoft-com:vml" xmlns:wp14="http://schemas.microsoft.com/office/word/2010/wordprocessingDrawing" xmlns:wp="http://schemas.openxmlformats.org/drawingml/2006/wordprocessingDrawing" xmlns:w10="urn:schemas-microsoft-com:office:word" xmlns:w="http://schemas.openxmlformats.org/wordprocessingml/2006/main" xmlns:w14="http://schemas.microsoft.com/office/word/2010/wordml" xmlns:w15="http://schemas.microsoft.com/office/word/2012/wordml" xmlns:w16cex="http://schemas.microsoft.com/office/word/2018/wordml/cex" xmlns:w16cid="http://schemas.microsoft.com/office/word/2016/wordml/cid" xmlns:w16="http://schemas.microsoft.com/office/word/2018/wordml" xmlns:w16du="http://schemas.microsoft.com/office/word/2023/wordml/word16du" xmlns:w16sdtdh="http://schemas.microsoft.com/office/word/2020/wordml/sdtdatahash" xmlns:w16sdtfl="http://schemas.microsoft.com/office/word/2024/wordml/sdtformatlock" xmlns:w16se="http://schemas.microsoft.com/office/word/2015/wordml/symex" xmlns:wpg="http://schemas.microsoft.com/office/word/2010/wordprocessingGroup" xmlns:wpi="http://schemas.microsoft.com/office/word/2010/wordprocessingInk" xmlns:wne="http://schemas.microsoft.com/office/word/2006/wordml" xmlns:wps="http://schemas.microsoft.com/office/word/2010/wordprocessingShape" mc:Ignorable="w14 w15 w16se w16cid w16 w16cex w16sdtdh w16sdtfl w16du wp14">
   <w:body>
     <w:p>
@@ -220,9 +169,6 @@
                 <w:szCs w:val="20"/>
               </w:rPr>
             </w:pPr>
-            <w:r>
-              <w:t>{cnpj}</w:t>
-            </w:r>
           </w:p>
         </w:tc>
       </w:tr>
@@ -265,9 +211,6 @@
                 <w:szCs w:val="20"/>
               </w:rPr>
             </w:pPr>
-            <w:r>
-              <w:t>{natureza_juridica}</w:t>
-            </w:r>
           </w:p>
         </w:tc>
       </w:tr>
@@ -310,9 +253,6 @@
                 <w:szCs w:val="20"/>
               </w:rPr>
             </w:pPr>
-            <w:r>
-              <w:t>{razao_social}</w:t>
-            </w:r>
           </w:p>
         </w:tc>
       </w:tr>
@@ -405,9 +345,6 @@
                 <w:szCs w:val="20"/>
               </w:rPr>
             </w:pPr>
-            <w:r>
-              <w:t>{endereco}</w:t>
-            </w:r>
           </w:p>
         </w:tc>
       </w:tr>
@@ -450,9 +387,6 @@
                 <w:szCs w:val="20"/>
               </w:rPr>
             </w:pPr>
-            <w:r>
-              <w:t>{data_abertura}</w:t>
-            </w:r>
           </w:p>
         </w:tc>
       </w:tr>
@@ -495,9 +429,6 @@
                 <w:szCs w:val="20"/>
               </w:rPr>
             </w:pPr>
-            <w:r>
-              <w:t>{email}</w:t>
-            </w:r>
           </w:p>
         </w:tc>
       </w:tr>
@@ -540,9 +471,6 @@
                 <w:szCs w:val="20"/>
               </w:rPr>
             </w:pPr>
-            <w:r>
-              <w:t>{telefone}</w:t>
-            </w:r>
           </w:p>
         </w:tc>
       </w:tr>
@@ -762,18 +690,6 @@
                 <w:szCs w:val="20"/>
               </w:rPr>
             </w:pPr>
-            <w:r>
-              <w:t>{hj_2_1_codigo}</w:t>
-            </w:r>
-            <w:r>
-              <w:t>{hj_2_1_emissao}</w:t>
-            </w:r>
-            <w:r>
-              <w:t>{hj_2_1_validade}</w:t>
-            </w:r>
-            <w:r>
-              <w:t>{hj_2_1_status}</w:t>
-            </w:r>
           </w:p>
         </w:tc>
         <w:tc>
@@ -962,18 +878,6 @@
                 <w:szCs w:val="20"/>
               </w:rPr>
             </w:pPr>
-            <w:r>
-              <w:t>{hj_2_3_codigo}</w:t>
-            </w:r>
-            <w:r>
-              <w:t>{hj_2_3_emissao}</w:t>
-            </w:r>
-            <w:r>
-              <w:t>{hj_2_3_validade}</w:t>
-            </w:r>
-            <w:r>
-              <w:t>{hj_2_3_status}</w:t>
-            </w:r>
           </w:p>
         </w:tc>
         <w:tc>
@@ -1064,18 +968,6 @@
                 <w:szCs w:val="20"/>
               </w:rPr>
             </w:pPr>
-            <w:r>
-              <w:t>{hj_2_4_codigo}</w:t>
-            </w:r>
-            <w:r>
-              <w:t>{hj_2_4_emissao}</w:t>
-            </w:r>
-            <w:r>
-              <w:t>{hj_2_4_validade}</w:t>
-            </w:r>
-            <w:r>
-              <w:t>{hj_2_4_status}</w:t>
-            </w:r>
           </w:p>
         </w:tc>
         <w:tc>
@@ -1166,18 +1058,6 @@
                 <w:szCs w:val="20"/>
               </w:rPr>
             </w:pPr>
-            <w:r>
-              <w:t>{hj_2_5_codigo}</w:t>
-            </w:r>
-            <w:r>
-              <w:t>{hj_2_5_emissao}</w:t>
-            </w:r>
-            <w:r>
-              <w:t>{hj_2_5_validade}</w:t>
-            </w:r>
-            <w:r>
-              <w:t>{hj_2_5_status}</w:t>
-            </w:r>
           </w:p>
         </w:tc>
         <w:tc>
@@ -1268,18 +1148,6 @@
                 <w:szCs w:val="20"/>
               </w:rPr>
             </w:pPr>
-            <w:r>
-              <w:t>{hj_2_6_codigo}</w:t>
-            </w:r>
-            <w:r>
-              <w:t>{hj_2_6_emissao}</w:t>
-            </w:r>
-            <w:r>
-              <w:t>{hj_2_6_validade}</w:t>
-            </w:r>
-            <w:r>
-              <w:t>{hj_2_6_status}</w:t>
-            </w:r>
           </w:p>
         </w:tc>
         <w:tc>
@@ -1370,18 +1238,6 @@
                 <w:szCs w:val="20"/>
               </w:rPr>
             </w:pPr>
-            <w:r>
-              <w:t>{hj_2_7_codigo}</w:t>
-            </w:r>
-            <w:r>
-              <w:t>{hj_2_7_emissao}</w:t>
-            </w:r>
-            <w:r>
-              <w:t>{hj_2_7_validade}</w:t>
-            </w:r>
-            <w:r>
-              <w:t>{hj_2_7_status}</w:t>
-            </w:r>
           </w:p>
         </w:tc>
         <w:tc>
@@ -1472,18 +1328,6 @@
                 <w:szCs w:val="20"/>
               </w:rPr>
             </w:pPr>
-            <w:r>
-              <w:t>{hj_2_8_codigo}</w:t>
-            </w:r>
-            <w:r>
-              <w:t>{hj_2_8_emissao}</w:t>
-            </w:r>
-            <w:r>
-              <w:t>{hj_2_8_validade}</w:t>
-            </w:r>
-            <w:r>
-              <w:t>{hj_2_8_status}</w:t>
-            </w:r>
           </w:p>
         </w:tc>
         <w:tc>
@@ -1574,18 +1418,6 @@
                 <w:szCs w:val="20"/>
               </w:rPr>
             </w:pPr>
-            <w:r>
-              <w:t>{hj_2_9_codigo}</w:t>
-            </w:r>
-            <w:r>
-              <w:t>{hj_2_9_emissao}</w:t>
-            </w:r>
-            <w:r>
-              <w:t>{hj_2_9_validade}</w:t>
-            </w:r>
-            <w:r>
-              <w:t>{hj_2_9_status}</w:t>
-            </w:r>
           </w:p>
         </w:tc>
         <w:tc>
@@ -1676,18 +1508,6 @@
                 <w:szCs w:val="20"/>
               </w:rPr>
             </w:pPr>
-            <w:r>
-              <w:t>{hj_2_10_codigo}</w:t>
-            </w:r>
-            <w:r>
-              <w:t>{hj_2_10_emissao}</w:t>
-            </w:r>
-            <w:r>
-              <w:t>{hj_2_10_validade}</w:t>
-            </w:r>
-            <w:r>
-              <w:t>{hj_2_10_status}</w:t>
-            </w:r>
           </w:p>
         </w:tc>
         <w:tc>
@@ -1778,18 +1598,6 @@
                 <w:szCs w:val="20"/>
               </w:rPr>
             </w:pPr>
-            <w:r>
-              <w:t>{hj_2_11_codigo}</w:t>
-            </w:r>
-            <w:r>
-              <w:t>{hj_2_11_emissao}</w:t>
-            </w:r>
-            <w:r>
-              <w:t>{hj_2_11_validade}</w:t>
-            </w:r>
-            <w:r>
-              <w:t>{hj_2_11_status}</w:t>
-            </w:r>
           </w:p>
         </w:tc>
         <w:tc>
@@ -2046,18 +1854,6 @@
                 <w:szCs w:val="20"/>
               </w:rPr>
             </w:pPr>
-            <w:r>
-              <w:t>{rf_3_1_codigo}</w:t>
-            </w:r>
-            <w:r>
-              <w:t>{rf_3_1_emissao}</w:t>
-            </w:r>
-            <w:r>
-              <w:t>{rf_3_1_validade}</w:t>
-            </w:r>
-            <w:r>
-              <w:t>{rf_3_1_status}</w:t>
-            </w:r>
           </w:p>
         </w:tc>
         <w:tc>
@@ -2145,18 +1941,6 @@
                 <w:szCs w:val="20"/>
               </w:rPr>
             </w:pPr>
-            <w:r>
-              <w:t>{rf_3_2_codigo}</w:t>
-            </w:r>
-            <w:r>
-              <w:t>{rf_3_2_emissao}</w:t>
-            </w:r>
-            <w:r>
-              <w:t>{rf_3_2_validade}</w:t>
-            </w:r>
-            <w:r>
-              <w:t>{rf_3_2_status}</w:t>
-            </w:r>
           </w:p>
         </w:tc>
         <w:tc>
@@ -2244,18 +2028,6 @@
                 <w:szCs w:val="20"/>
               </w:rPr>
             </w:pPr>
-            <w:r>
-              <w:t>{rf_3_3_codigo}</w:t>
-            </w:r>
-            <w:r>
-              <w:t>{rf_3_3_emissao}</w:t>
-            </w:r>
-            <w:r>
-              <w:t>{rf_3_3_validade}</w:t>
-            </w:r>
-            <w:r>
-              <w:t>{rf_3_3_status}</w:t>
-            </w:r>
           </w:p>
         </w:tc>
         <w:tc>
@@ -2343,18 +2115,6 @@
                 <w:szCs w:val="20"/>
               </w:rPr>
             </w:pPr>
-            <w:r>
-              <w:t>{rf_3_4_codigo}</w:t>
-            </w:r>
-            <w:r>
-              <w:t>{rf_3_4_emissao}</w:t>
-            </w:r>
-            <w:r>
-              <w:t>{rf_3_4_validade}</w:t>
-            </w:r>
-            <w:r>
-              <w:t>{rf_3_4_status}</w:t>
-            </w:r>
           </w:p>
         </w:tc>
         <w:tc>
@@ -2442,18 +2202,6 @@
                 <w:szCs w:val="20"/>
               </w:rPr>
             </w:pPr>
-            <w:r>
-              <w:t>{rf_3_5_codigo}</w:t>
-            </w:r>
-            <w:r>
-              <w:t>{rf_3_5_emissao}</w:t>
-            </w:r>
-            <w:r>
-              <w:t>{rf_3_5_validade}</w:t>
-            </w:r>
-            <w:r>
-              <w:t>{rf_3_5_status}</w:t>
-            </w:r>
           </w:p>
         </w:tc>
         <w:tc>
@@ -2541,18 +2289,6 @@
                 <w:szCs w:val="20"/>
               </w:rPr>
             </w:pPr>
-            <w:r>
-              <w:t>{rf_3_6_codigo}</w:t>
-            </w:r>
-            <w:r>
-              <w:t>{rf_3_6_emissao}</w:t>
-            </w:r>
-            <w:r>
-              <w:t>{rf_3_6_validade}</w:t>
-            </w:r>
-            <w:r>
-              <w:t>{rf_3_6_status}</w:t>
-            </w:r>
           </w:p>
         </w:tc>
         <w:tc>
@@ -2925,18 +2661,6 @@
                 <w:szCs w:val="20"/>
               </w:rPr>
             </w:pPr>
-            <w:r>
-              <w:t>{qe_4_1_codigo}</w:t>
-            </w:r>
-            <w:r>
-              <w:t>{qe_4_1_emissao}</w:t>
-            </w:r>
-            <w:r>
-              <w:t>{qe_4_1_validade}</w:t>
-            </w:r>
-            <w:r>
-              <w:t>{qe_4_1_status}</w:t>
-            </w:r>
           </w:p>
         </w:tc>
         <w:tc>
@@ -3024,18 +2748,6 @@
                 <w:szCs w:val="20"/>
               </w:rPr>
             </w:pPr>
-            <w:r>
-              <w:t>{qe_4_2_codigo}</w:t>
-            </w:r>
-            <w:r>
-              <w:t>{qe_4_2_emissao}</w:t>
-            </w:r>
-            <w:r>
-              <w:t>{qe_4_2_validade}</w:t>
-            </w:r>
-            <w:r>
-              <w:t>{qe_4_2_status}</w:t>
-            </w:r>
           </w:p>
         </w:tc>
         <w:tc>
@@ -3122,18 +2834,6 @@
                 <w:szCs w:val="20"/>
               </w:rPr>
             </w:pPr>
-            <w:r>
-              <w:t>{qe_4_3_codigo}</w:t>
-            </w:r>
-            <w:r>
-              <w:t>{qe_4_3_emissao}</w:t>
-            </w:r>
-            <w:r>
-              <w:t>{qe_4_3_validade}</w:t>
-            </w:r>
-            <w:r>
-              <w:t>{qe_4_3_status}</w:t>
-            </w:r>
           </w:p>
         </w:tc>
         <w:tc>
@@ -3228,18 +2928,6 @@
                 <w:szCs w:val="20"/>
               </w:rPr>
             </w:pPr>
-            <w:r>
-              <w:t>{qe_4_4_codigo}</w:t>
-            </w:r>
-            <w:r>
-              <w:t>{qe_4_4_emissao}</w:t>
-            </w:r>
-            <w:r>
-              <w:t>{qe_4_4_validade}</w:t>
-            </w:r>
-            <w:r>
-              <w:t>{qe_4_4_status}</w:t>
-            </w:r>
           </w:p>
         </w:tc>
         <w:tc>
@@ -3326,18 +3014,6 @@
                 <w:szCs w:val="20"/>
               </w:rPr>
             </w:pPr>
-            <w:r>
-              <w:t>{qe_4_5_codigo}</w:t>
-            </w:r>
-            <w:r>
-              <w:t>{qe_4_5_emissao}</w:t>
-            </w:r>
-            <w:r>
-              <w:t>{qe_4_5_validade}</w:t>
-            </w:r>
-            <w:r>
-              <w:t>{qe_4_5_status}</w:t>
-            </w:r>
           </w:p>
         </w:tc>
         <w:tc>
@@ -3424,18 +3100,6 @@
                 <w:szCs w:val="20"/>
               </w:rPr>
             </w:pPr>
-            <w:r>
-              <w:t>{qe_4_6_codigo}</w:t>
-            </w:r>
-            <w:r>
-              <w:t>{qe_4_6_emissao}</w:t>
-            </w:r>
-            <w:r>
-              <w:t>{qe_4_6_validade}</w:t>
-            </w:r>
-            <w:r>
-              <w:t>{qe_4_6_status}</w:t>
-            </w:r>
           </w:p>
         </w:tc>
         <w:tc>
@@ -3522,18 +3186,6 @@
                 <w:szCs w:val="20"/>
               </w:rPr>
             </w:pPr>
-            <w:r>
-              <w:t>{qe_4_7_codigo}</w:t>
-            </w:r>
-            <w:r>
-              <w:t>{qe_4_7_emissao}</w:t>
-            </w:r>
-            <w:r>
-              <w:t>{qe_4_7_validade}</w:t>
-            </w:r>
-            <w:r>
-              <w:t>{qe_4_7_status}</w:t>
-            </w:r>
           </w:p>
         </w:tc>
         <w:tc>
@@ -3620,18 +3272,6 @@
                 <w:szCs w:val="20"/>
               </w:rPr>
             </w:pPr>
-            <w:r>
-              <w:t>{qe_4_8_codigo}</w:t>
-            </w:r>
-            <w:r>
-              <w:t>{qe_4_8_emissao}</w:t>
-            </w:r>
-            <w:r>
-              <w:t>{qe_4_8_validade}</w:t>
-            </w:r>
-            <w:r>
-              <w:t>{qe_4_8_status}</w:t>
-            </w:r>
           </w:p>
         </w:tc>
         <w:tc>
@@ -3718,18 +3358,6 @@
                 <w:szCs w:val="20"/>
               </w:rPr>
             </w:pPr>
-            <w:r>
-              <w:t>{qe_4_9_codigo}</w:t>
-            </w:r>
-            <w:r>
-              <w:t>{qe_4_9_emissao}</w:t>
-            </w:r>
-            <w:r>
-              <w:t>{qe_4_9_validade}</w:t>
-            </w:r>
-            <w:r>
-              <w:t>{qe_4_9_status}</w:t>
-            </w:r>
           </w:p>
         </w:tc>
         <w:tc>
@@ -3816,18 +3444,6 @@
                 <w:szCs w:val="20"/>
               </w:rPr>
             </w:pPr>
-            <w:r>
-              <w:t>{qe_4_10_codigo}</w:t>
-            </w:r>
-            <w:r>
-              <w:t>{qe_4_10_emissao}</w:t>
-            </w:r>
-            <w:r>
-              <w:t>{qe_4_10_validade}</w:t>
-            </w:r>
-            <w:r>
-              <w:t>{qe_4_10_status}</w:t>
-            </w:r>
           </w:p>
         </w:tc>
         <w:tc>
@@ -5178,18 +4794,6 @@
                 <w:szCs w:val="20"/>
               </w:rPr>
             </w:pPr>
-            <w:r>
-              <w:t>{or_6_5_codigo}</w:t>
-            </w:r>
-            <w:r>
-              <w:t>{or_6_5_emissao}</w:t>
-            </w:r>
-            <w:r>
-              <w:t>{or_6_5_validade}</w:t>
-            </w:r>
-            <w:r>
-              <w:t>{or_6_5_status}</w:t>
-            </w:r>
           </w:p>
         </w:tc>
         <w:tc>
@@ -6591,7 +6195,7 @@
 </w:document>
 </file>
 
-<file path=word\endnotes.xml><?xml version="1.0" encoding="utf-8"?>
+<file path=word/endnotes.xml><?xml version="1.0" encoding="utf-8"?>
 <w:endnotes xmlns:wpc="http://schemas.microsoft.com/office/word/2010/wordprocessingCanvas" xmlns:cx="http://schemas.microsoft.com/office/drawing/2014/chartex" xmlns:cx1="http://schemas.microsoft.com/office/drawing/2015/9/8/chartex" xmlns:cx2="http://schemas.microsoft.com/office/drawing/2015/10/21/chartex" xmlns:cx3="http://schemas.microsoft.com/office/drawing/2016/5/9/chartex" xmlns:cx4="http://schemas.microsoft.com/office/drawing/2016/5/10/chartex" xmlns:cx5="http://schemas.microsoft.com/office/drawing/2016/5/11/chartex" xmlns:cx6="http://schemas.microsoft.com/office/drawing/2016/5/12/chartex" xmlns:cx7="http://schemas.microsoft.com/office/drawing/2016/5/13/chartex" xmlns:cx8="http://schemas.microsoft.com/office/drawing/2016/5/14/chartex" xmlns:mc="http://schemas.openxmlformats.org/markup-compatibility/2006" xmlns:aink="http://schemas.microsoft.com/office/drawing/2016/ink" xmlns:am3d="http://schemas.microsoft.com/office/drawing/2017/model3d" xmlns:o="urn:schemas-microsoft-com:office:office" xmlns:oel="http://schemas.microsoft.com/office/2019/extlst" xmlns:r="http://schemas.openxmlformats.org/officeDocument/2006/relationships" xmlns:m="http://schemas.openxmlformats.org/officeDocument/2006/math" xmlns:v="urn:schemas-microsoft-com:vml" xmlns:wp14="http://schemas.microsoft.com/office/word/2010/wordprocessingDrawing" xmlns:wp="http://schemas.openxmlformats.org/drawingml/2006/wordprocessingDrawing" xmlns:w10="urn:schemas-microsoft-com:office:word" xmlns:w="http://schemas.openxmlformats.org/wordprocessingml/2006/main" xmlns:w14="http://schemas.microsoft.com/office/word/2010/wordml" xmlns:w15="http://schemas.microsoft.com/office/word/2012/wordml" xmlns:w16cex="http://schemas.microsoft.com/office/word/2018/wordml/cex" xmlns:w16cid="http://schemas.microsoft.com/office/word/2016/wordml/cid" xmlns:w16="http://schemas.microsoft.com/office/word/2018/wordml" xmlns:w16du="http://schemas.microsoft.com/office/word/2023/wordml/word16du" xmlns:w16sdtdh="http://schemas.microsoft.com/office/word/2020/wordml/sdtdatahash" xmlns:w16sdtfl="http://schemas.microsoft.com/office/word/2024/wordml/sdtformatlock" xmlns:w16se="http://schemas.microsoft.com/office/word/2015/wordml/symex" xmlns:wpg="http://schemas.microsoft.com/office/word/2010/wordprocessingGroup" xmlns:wpi="http://schemas.microsoft.com/office/word/2010/wordprocessingInk" xmlns:wne="http://schemas.microsoft.com/office/word/2006/wordml" xmlns:wps="http://schemas.microsoft.com/office/word/2010/wordprocessingShape" mc:Ignorable="w14 w15 w16se w16cid w16 w16cex w16sdtdh w16sdtfl w16du wp14">
   <w:endnote w:type="separator" w:id="-1">
     <w:p>
@@ -6616,45 +6220,7 @@
 </w:endnotes>
 </file>
 
-<file path=word\fontTable.xml><?xml version="1.0" encoding="utf-8"?>
-<w:fonts xmlns:mc="http://schemas.openxmlformats.org/markup-compatibility/2006" xmlns:r="http://schemas.openxmlformats.org/officeDocument/2006/relationships" xmlns:w="http://schemas.openxmlformats.org/wordprocessingml/2006/main" xmlns:w14="http://schemas.microsoft.com/office/word/2010/wordml" xmlns:w15="http://schemas.microsoft.com/office/word/2012/wordml" xmlns:w16cex="http://schemas.microsoft.com/office/word/2018/wordml/cex" xmlns:w16cid="http://schemas.microsoft.com/office/word/2016/wordml/cid" xmlns:w16="http://schemas.microsoft.com/office/word/2018/wordml" xmlns:w16du="http://schemas.microsoft.com/office/word/2023/wordml/word16du" xmlns:w16sdtdh="http://schemas.microsoft.com/office/word/2020/wordml/sdtdatahash" xmlns:w16sdtfl="http://schemas.microsoft.com/office/word/2024/wordml/sdtformatlock" xmlns:w16se="http://schemas.microsoft.com/office/word/2015/wordml/symex" mc:Ignorable="w14 w15 w16se w16cid w16 w16cex w16sdtdh w16sdtfl w16du">
-  <w:font w:name="Times New Roman">
-    <w:panose1 w:val="02020603050405020304"/>
-    <w:charset w:val="00"/>
-    <w:family w:val="roman"/>
-    <w:pitch w:val="variable"/>
-    <w:sig w:usb0="E0002EFF" w:usb1="C000785B" w:usb2="00000009" w:usb3="00000000" w:csb0="000001FF" w:csb1="00000000"/>
-  </w:font>
-  <w:font w:name="Aptos">
-    <w:charset w:val="00"/>
-    <w:family w:val="swiss"/>
-    <w:pitch w:val="variable"/>
-    <w:sig w:usb0="20000287" w:usb1="00000003" w:usb2="00000000" w:usb3="00000000" w:csb0="0000019F" w:csb1="00000000"/>
-  </w:font>
-  <w:font w:name="Aptos Display">
-    <w:charset w:val="00"/>
-    <w:family w:val="swiss"/>
-    <w:pitch w:val="variable"/>
-    <w:sig w:usb0="20000287" w:usb1="00000003" w:usb2="00000000" w:usb3="00000000" w:csb0="0000019F" w:csb1="00000000"/>
-  </w:font>
-  <w:font w:name="Arial">
-    <w:panose1 w:val="020B0604020202020204"/>
-    <w:charset w:val="00"/>
-    <w:family w:val="swiss"/>
-    <w:pitch w:val="variable"/>
-    <w:sig w:usb0="E0002EFF" w:usb1="C000785B" w:usb2="00000009" w:usb3="00000000" w:csb0="000001FF" w:csb1="00000000"/>
-  </w:font>
-  <w:font w:name="Arial Narrow">
-    <w:panose1 w:val="020B0606020202030204"/>
-    <w:charset w:val="00"/>
-    <w:family w:val="swiss"/>
-    <w:pitch w:val="variable"/>
-    <w:sig w:usb0="00000287" w:usb1="00000800" w:usb2="00000000" w:usb3="00000000" w:csb0="0000009F" w:csb1="00000000"/>
-  </w:font>
-</w:fonts>
-</file>
-
-<file path=word\footer1.xml><?xml version="1.0" encoding="utf-8"?>
+<file path=word/footer1.xml><?xml version="1.0" encoding="utf-8"?>
 <w:ftr xmlns:wpc="http://schemas.microsoft.com/office/word/2010/wordprocessingCanvas" xmlns:cx="http://schemas.microsoft.com/office/drawing/2014/chartex" xmlns:cx1="http://schemas.microsoft.com/office/drawing/2015/9/8/chartex" xmlns:cx2="http://schemas.microsoft.com/office/drawing/2015/10/21/chartex" xmlns:cx3="http://schemas.microsoft.com/office/drawing/2016/5/9/chartex" xmlns:cx4="http://schemas.microsoft.com/office/drawing/2016/5/10/chartex" xmlns:cx5="http://schemas.microsoft.com/office/drawing/2016/5/11/chartex" xmlns:cx6="http://schemas.microsoft.com/office/drawing/2016/5/12/chartex" xmlns:cx7="http://schemas.microsoft.com/office/drawing/2016/5/13/chartex" xmlns:cx8="http://schemas.microsoft.com/office/drawing/2016/5/14/chartex" xmlns:mc="http://schemas.openxmlformats.org/markup-compatibility/2006" xmlns:aink="http://schemas.microsoft.com/office/drawing/2016/ink" xmlns:am3d="http://schemas.microsoft.com/office/drawing/2017/model3d" xmlns:o="urn:schemas-microsoft-com:office:office" xmlns:oel="http://schemas.microsoft.com/office/2019/extlst" xmlns:r="http://schemas.openxmlformats.org/officeDocument/2006/relationships" xmlns:m="http://schemas.openxmlformats.org/officeDocument/2006/math" xmlns:v="urn:schemas-microsoft-com:vml" xmlns:wp14="http://schemas.microsoft.com/office/word/2010/wordprocessingDrawing" xmlns:wp="http://schemas.openxmlformats.org/drawingml/2006/wordprocessingDrawing" xmlns:w10="urn:schemas-microsoft-com:office:word" xmlns:w="http://schemas.openxmlformats.org/wordprocessingml/2006/main" xmlns:w14="http://schemas.microsoft.com/office/word/2010/wordml" xmlns:w15="http://schemas.microsoft.com/office/word/2012/wordml" xmlns:w16cex="http://schemas.microsoft.com/office/word/2018/wordml/cex" xmlns:w16cid="http://schemas.microsoft.com/office/word/2016/wordml/cid" xmlns:w16="http://schemas.microsoft.com/office/word/2018/wordml" xmlns:w16du="http://schemas.microsoft.com/office/word/2023/wordml/word16du" xmlns:w16sdtdh="http://schemas.microsoft.com/office/word/2020/wordml/sdtdatahash" xmlns:w16sdtfl="http://schemas.microsoft.com/office/word/2024/wordml/sdtformatlock" xmlns:w16se="http://schemas.microsoft.com/office/word/2015/wordml/symex" xmlns:wpg="http://schemas.microsoft.com/office/word/2010/wordprocessingGroup" xmlns:wpi="http://schemas.microsoft.com/office/word/2010/wordprocessingInk" xmlns:wne="http://schemas.microsoft.com/office/word/2006/wordml" xmlns:wps="http://schemas.microsoft.com/office/word/2010/wordprocessingShape" mc:Ignorable="w14 w15 w16se w16cid w16 w16cex w16sdtdh w16sdtfl w16du wp14">
   <w:p>
     <w:pPr>
@@ -6739,7 +6305,7 @@
 </w:ftr>
 </file>
 
-<file path=word\footnotes.xml><?xml version="1.0" encoding="utf-8"?>
+<file path=word/footnotes.xml><?xml version="1.0" encoding="utf-8"?>
 <w:footnotes xmlns:wpc="http://schemas.microsoft.com/office/word/2010/wordprocessingCanvas" xmlns:cx="http://schemas.microsoft.com/office/drawing/2014/chartex" xmlns:cx1="http://schemas.microsoft.com/office/drawing/2015/9/8/chartex" xmlns:cx2="http://schemas.microsoft.com/office/drawing/2015/10/21/chartex" xmlns:cx3="http://schemas.microsoft.com/office/drawing/2016/5/9/chartex" xmlns:cx4="http://schemas.microsoft.com/office/drawing/2016/5/10/chartex" xmlns:cx5="http://schemas.microsoft.com/office/drawing/2016/5/11/chartex" xmlns:cx6="http://schemas.microsoft.com/office/drawing/2016/5/12/chartex" xmlns:cx7="http://schemas.microsoft.com/office/drawing/2016/5/13/chartex" xmlns:cx8="http://schemas.microsoft.com/office/drawing/2016/5/14/chartex" xmlns:mc="http://schemas.openxmlformats.org/markup-compatibility/2006" xmlns:aink="http://schemas.microsoft.com/office/drawing/2016/ink" xmlns:am3d="http://schemas.microsoft.com/office/drawing/2017/model3d" xmlns:o="urn:schemas-microsoft-com:office:office" xmlns:oel="http://schemas.microsoft.com/office/2019/extlst" xmlns:r="http://schemas.openxmlformats.org/officeDocument/2006/relationships" xmlns:m="http://schemas.openxmlformats.org/officeDocument/2006/math" xmlns:v="urn:schemas-microsoft-com:vml" xmlns:wp14="http://schemas.microsoft.com/office/word/2010/wordprocessingDrawing" xmlns:wp="http://schemas.openxmlformats.org/drawingml/2006/wordprocessingDrawing" xmlns:w10="urn:schemas-microsoft-com:office:word" xmlns:w="http://schemas.openxmlformats.org/wordprocessingml/2006/main" xmlns:w14="http://schemas.microsoft.com/office/word/2010/wordml" xmlns:w15="http://schemas.microsoft.com/office/word/2012/wordml" xmlns:w16cex="http://schemas.microsoft.com/office/word/2018/wordml/cex" xmlns:w16cid="http://schemas.microsoft.com/office/word/2016/wordml/cid" xmlns:w16="http://schemas.microsoft.com/office/word/2018/wordml" xmlns:w16du="http://schemas.microsoft.com/office/word/2023/wordml/word16du" xmlns:w16sdtdh="http://schemas.microsoft.com/office/word/2020/wordml/sdtdatahash" xmlns:w16sdtfl="http://schemas.microsoft.com/office/word/2024/wordml/sdtformatlock" xmlns:w16se="http://schemas.microsoft.com/office/word/2015/wordml/symex" xmlns:wpg="http://schemas.microsoft.com/office/word/2010/wordprocessingGroup" xmlns:wpi="http://schemas.microsoft.com/office/word/2010/wordprocessingInk" xmlns:wne="http://schemas.microsoft.com/office/word/2006/wordml" xmlns:wps="http://schemas.microsoft.com/office/word/2010/wordprocessingShape" mc:Ignorable="w14 w15 w16se w16cid w16 w16cex w16sdtdh w16sdtfl w16du wp14">
   <w:footnote w:type="separator" w:id="-1">
     <w:p>
@@ -6764,7 +6330,7 @@
 </w:footnotes>
 </file>
 
-<file path=word\header1.xml><?xml version="1.0" encoding="utf-8"?>
+<file path=word/header1.xml><?xml version="1.0" encoding="utf-8"?>
 <w:hdr xmlns:wpc="http://schemas.microsoft.com/office/word/2010/wordprocessingCanvas" xmlns:cx="http://schemas.microsoft.com/office/drawing/2014/chartex" xmlns:cx1="http://schemas.microsoft.com/office/drawing/2015/9/8/chartex" xmlns:cx2="http://schemas.microsoft.com/office/drawing/2015/10/21/chartex" xmlns:cx3="http://schemas.microsoft.com/office/drawing/2016/5/9/chartex" xmlns:cx4="http://schemas.microsoft.com/office/drawing/2016/5/10/chartex" xmlns:cx5="http://schemas.microsoft.com/office/drawing/2016/5/11/chartex" xmlns:cx6="http://schemas.microsoft.com/office/drawing/2016/5/12/chartex" xmlns:cx7="http://schemas.microsoft.com/office/drawing/2016/5/13/chartex" xmlns:cx8="http://schemas.microsoft.com/office/drawing/2016/5/14/chartex" xmlns:mc="http://schemas.openxmlformats.org/markup-compatibility/2006" xmlns:aink="http://schemas.microsoft.com/office/drawing/2016/ink" xmlns:am3d="http://schemas.microsoft.com/office/drawing/2017/model3d" xmlns:o="urn:schemas-microsoft-com:office:office" xmlns:oel="http://schemas.microsoft.com/office/2019/extlst" xmlns:r="http://schemas.openxmlformats.org/officeDocument/2006/relationships" xmlns:m="http://schemas.openxmlformats.org/officeDocument/2006/math" xmlns:v="urn:schemas-microsoft-com:vml" xmlns:wp14="http://schemas.microsoft.com/office/word/2010/wordprocessingDrawing" xmlns:wp="http://schemas.openxmlformats.org/drawingml/2006/wordprocessingDrawing" xmlns:w10="urn:schemas-microsoft-com:office:word" xmlns:w="http://schemas.openxmlformats.org/wordprocessingml/2006/main" xmlns:w14="http://schemas.microsoft.com/office/word/2010/wordml" xmlns:w15="http://schemas.microsoft.com/office/word/2012/wordml" xmlns:w16cex="http://schemas.microsoft.com/office/word/2018/wordml/cex" xmlns:w16cid="http://schemas.microsoft.com/office/word/2016/wordml/cid" xmlns:w16="http://schemas.microsoft.com/office/word/2018/wordml" xmlns:w16du="http://schemas.microsoft.com/office/word/2023/wordml/word16du" xmlns:w16sdtdh="http://schemas.microsoft.com/office/word/2020/wordml/sdtdatahash" xmlns:w16sdtfl="http://schemas.microsoft.com/office/word/2024/wordml/sdtformatlock" xmlns:w16se="http://schemas.microsoft.com/office/word/2015/wordml/symex" xmlns:wpg="http://schemas.microsoft.com/office/word/2010/wordprocessingGroup" xmlns:wpi="http://schemas.microsoft.com/office/word/2010/wordprocessingInk" xmlns:wne="http://schemas.microsoft.com/office/word/2006/wordml" xmlns:wps="http://schemas.microsoft.com/office/word/2010/wordprocessingShape" mc:Ignorable="w14 w15 w16se w16cid w16 w16cex w16sdtdh w16sdtfl w16du wp14">
   <w:p>
     <w:pPr>
@@ -6804,7 +6370,7 @@
 </w:hdr>
 </file>
 
-<file path=word\header2.xml><?xml version="1.0" encoding="utf-8"?>
+<file path=word/header2.xml><?xml version="1.0" encoding="utf-8"?>
 <w:hdr xmlns:wpc="http://schemas.microsoft.com/office/word/2010/wordprocessingCanvas" xmlns:cx="http://schemas.microsoft.com/office/drawing/2014/chartex" xmlns:cx1="http://schemas.microsoft.com/office/drawing/2015/9/8/chartex" xmlns:cx2="http://schemas.microsoft.com/office/drawing/2015/10/21/chartex" xmlns:cx3="http://schemas.microsoft.com/office/drawing/2016/5/9/chartex" xmlns:cx4="http://schemas.microsoft.com/office/drawing/2016/5/10/chartex" xmlns:cx5="http://schemas.microsoft.com/office/drawing/2016/5/11/chartex" xmlns:cx6="http://schemas.microsoft.com/office/drawing/2016/5/12/chartex" xmlns:cx7="http://schemas.microsoft.com/office/drawing/2016/5/13/chartex" xmlns:cx8="http://schemas.microsoft.com/office/drawing/2016/5/14/chartex" xmlns:mc="http://schemas.openxmlformats.org/markup-compatibility/2006" xmlns:aink="http://schemas.microsoft.com/office/drawing/2016/ink" xmlns:am3d="http://schemas.microsoft.com/office/drawing/2017/model3d" xmlns:o="urn:schemas-microsoft-com:office:office" xmlns:oel="http://schemas.microsoft.com/office/2019/extlst" xmlns:r="http://schemas.openxmlformats.org/officeDocument/2006/relationships" xmlns:m="http://schemas.openxmlformats.org/officeDocument/2006/math" xmlns:v="urn:schemas-microsoft-com:vml" xmlns:wp14="http://schemas.microsoft.com/office/word/2010/wordprocessingDrawing" xmlns:wp="http://schemas.openxmlformats.org/drawingml/2006/wordprocessingDrawing" xmlns:w10="urn:schemas-microsoft-com:office:word" xmlns:w="http://schemas.openxmlformats.org/wordprocessingml/2006/main" xmlns:w14="http://schemas.microsoft.com/office/word/2010/wordml" xmlns:w15="http://schemas.microsoft.com/office/word/2012/wordml" xmlns:w16cex="http://schemas.microsoft.com/office/word/2018/wordml/cex" xmlns:w16cid="http://schemas.microsoft.com/office/word/2016/wordml/cid" xmlns:w16="http://schemas.microsoft.com/office/word/2018/wordml" xmlns:w16du="http://schemas.microsoft.com/office/word/2023/wordml/word16du" xmlns:w16sdtdh="http://schemas.microsoft.com/office/word/2020/wordml/sdtdatahash" xmlns:w16sdtfl="http://schemas.microsoft.com/office/word/2024/wordml/sdtformatlock" xmlns:w16se="http://schemas.microsoft.com/office/word/2015/wordml/symex" xmlns:wpg="http://schemas.microsoft.com/office/word/2010/wordprocessingGroup" xmlns:wpi="http://schemas.microsoft.com/office/word/2010/wordprocessingInk" xmlns:wne="http://schemas.microsoft.com/office/word/2006/wordml" xmlns:wps="http://schemas.microsoft.com/office/word/2010/wordprocessingShape" mc:Ignorable="w14 w15 w16se w16cid w16 w16cex w16sdtdh w16sdtfl w16du wp14">
   <w:p>
     <w:pPr>
@@ -6891,7 +6457,7 @@
 </w:hdr>
 </file>
 
-<file path=word\header3.xml><?xml version="1.0" encoding="utf-8"?>
+<file path=word/header3.xml><?xml version="1.0" encoding="utf-8"?>
 <w:hdr xmlns:wpc="http://schemas.microsoft.com/office/word/2010/wordprocessingCanvas" xmlns:cx="http://schemas.microsoft.com/office/drawing/2014/chartex" xmlns:cx1="http://schemas.microsoft.com/office/drawing/2015/9/8/chartex" xmlns:cx2="http://schemas.microsoft.com/office/drawing/2015/10/21/chartex" xmlns:cx3="http://schemas.microsoft.com/office/drawing/2016/5/9/chartex" xmlns:cx4="http://schemas.microsoft.com/office/drawing/2016/5/10/chartex" xmlns:cx5="http://schemas.microsoft.com/office/drawing/2016/5/11/chartex" xmlns:cx6="http://schemas.microsoft.com/office/drawing/2016/5/12/chartex" xmlns:cx7="http://schemas.microsoft.com/office/drawing/2016/5/13/chartex" xmlns:cx8="http://schemas.microsoft.com/office/drawing/2016/5/14/chartex" xmlns:mc="http://schemas.openxmlformats.org/markup-compatibility/2006" xmlns:aink="http://schemas.microsoft.com/office/drawing/2016/ink" xmlns:am3d="http://schemas.microsoft.com/office/drawing/2017/model3d" xmlns:o="urn:schemas-microsoft-com:office:office" xmlns:oel="http://schemas.microsoft.com/office/2019/extlst" xmlns:r="http://schemas.openxmlformats.org/officeDocument/2006/relationships" xmlns:m="http://schemas.openxmlformats.org/officeDocument/2006/math" xmlns:v="urn:schemas-microsoft-com:vml" xmlns:wp14="http://schemas.microsoft.com/office/word/2010/wordprocessingDrawing" xmlns:wp="http://schemas.openxmlformats.org/drawingml/2006/wordprocessingDrawing" xmlns:w10="urn:schemas-microsoft-com:office:word" xmlns:w="http://schemas.openxmlformats.org/wordprocessingml/2006/main" xmlns:w14="http://schemas.microsoft.com/office/word/2010/wordml" xmlns:w15="http://schemas.microsoft.com/office/word/2012/wordml" xmlns:w16cex="http://schemas.microsoft.com/office/word/2018/wordml/cex" xmlns:w16cid="http://schemas.microsoft.com/office/word/2016/wordml/cid" xmlns:w16="http://schemas.microsoft.com/office/word/2018/wordml" xmlns:w16du="http://schemas.microsoft.com/office/word/2023/wordml/word16du" xmlns:w16sdtdh="http://schemas.microsoft.com/office/word/2020/wordml/sdtdatahash" xmlns:w16sdtfl="http://schemas.microsoft.com/office/word/2024/wordml/sdtformatlock" xmlns:w16se="http://schemas.microsoft.com/office/word/2015/wordml/symex" xmlns:wpg="http://schemas.microsoft.com/office/word/2010/wordprocessingGroup" xmlns:wpi="http://schemas.microsoft.com/office/word/2010/wordprocessingInk" xmlns:wne="http://schemas.microsoft.com/office/word/2006/wordml" xmlns:wps="http://schemas.microsoft.com/office/word/2010/wordprocessingShape" mc:Ignorable="w14 w15 w16se w16cid w16 w16cex w16sdtdh w16sdtfl w16du wp14">
   <w:p>
     <w:pPr>
@@ -6931,7 +6497,7 @@
 </w:hdr>
 </file>
 
-<file path=word\numbering.xml><?xml version="1.0" encoding="utf-8"?>
+<file path=word/numbering.xml><?xml version="1.0" encoding="utf-8"?>
 <w:numbering xmlns:wpc="http://schemas.microsoft.com/office/word/2010/wordprocessingCanvas" xmlns:cx="http://schemas.microsoft.com/office/drawing/2014/chartex" xmlns:cx1="http://schemas.microsoft.com/office/drawing/2015/9/8/chartex" xmlns:cx2="http://schemas.microsoft.com/office/drawing/2015/10/21/chartex" xmlns:cx3="http://schemas.microsoft.com/office/drawing/2016/5/9/chartex" xmlns:cx4="http://schemas.microsoft.com/office/drawing/2016/5/10/chartex" xmlns:cx5="http://schemas.microsoft.com/office/drawing/2016/5/11/chartex" xmlns:cx6="http://schemas.microsoft.com/office/drawing/2016/5/12/chartex" xmlns:cx7="http://schemas.microsoft.com/office/drawing/2016/5/13/chartex" xmlns:cx8="http://schemas.microsoft.com/office/drawing/2016/5/14/chartex" xmlns:mc="http://schemas.openxmlformats.org/markup-compatibility/2006" xmlns:aink="http://schemas.microsoft.com/office/drawing/2016/ink" xmlns:am3d="http://schemas.microsoft.com/office/drawing/2017/model3d" xmlns:o="urn:schemas-microsoft-com:office:office" xmlns:oel="http://schemas.microsoft.com/office/2019/extlst" xmlns:r="http://schemas.openxmlformats.org/officeDocument/2006/relationships" xmlns:m="http://schemas.openxmlformats.org/officeDocument/2006/math" xmlns:v="urn:schemas-microsoft-com:vml" xmlns:wp14="http://schemas.microsoft.com/office/word/2010/wordprocessingDrawing" xmlns:wp="http://schemas.openxmlformats.org/drawingml/2006/wordprocessingDrawing" xmlns:w10="urn:schemas-microsoft-com:office:word" xmlns:w="http://schemas.openxmlformats.org/wordprocessingml/2006/main" xmlns:w14="http://schemas.microsoft.com/office/word/2010/wordml" xmlns:w15="http://schemas.microsoft.com/office/word/2012/wordml" xmlns:w16cex="http://schemas.microsoft.com/office/word/2018/wordml/cex" xmlns:w16cid="http://schemas.microsoft.com/office/word/2016/wordml/cid" xmlns:w16="http://schemas.microsoft.com/office/word/2018/wordml" xmlns:w16du="http://schemas.microsoft.com/office/word/2023/wordml/word16du" xmlns:w16sdtdh="http://schemas.microsoft.com/office/word/2020/wordml/sdtdatahash" xmlns:w16sdtfl="http://schemas.microsoft.com/office/word/2024/wordml/sdtformatlock" xmlns:w16se="http://schemas.microsoft.com/office/word/2015/wordml/symex" xmlns:wpg="http://schemas.microsoft.com/office/word/2010/wordprocessingGroup" xmlns:wpi="http://schemas.microsoft.com/office/word/2010/wordprocessingInk" xmlns:wne="http://schemas.microsoft.com/office/word/2006/wordml" xmlns:wps="http://schemas.microsoft.com/office/word/2010/wordprocessingShape" mc:Ignorable="w14 w15 w16se w16cid w16 w16cex w16sdtdh w16sdtfl w16du wp14">
   <w:abstractNum w:abstractNumId="0" w15:restartNumberingAfterBreak="0">
     <w:nsid w:val="19FA3A4F"/>
@@ -7392,170 +6958,7 @@
 </w:numbering>
 </file>
 
-<file path=word\settings.xml><?xml version="1.0" encoding="utf-8"?>
-<w:settings xmlns:mc="http://schemas.openxmlformats.org/markup-compatibility/2006" xmlns:o="urn:schemas-microsoft-com:office:office" xmlns:r="http://schemas.openxmlformats.org/officeDocument/2006/relationships" xmlns:m="http://schemas.openxmlformats.org/officeDocument/2006/math" xmlns:v="urn:schemas-microsoft-com:vml" xmlns:w10="urn:schemas-microsoft-com:office:word" xmlns:w="http://schemas.openxmlformats.org/wordprocessingml/2006/main" xmlns:w14="http://schemas.microsoft.com/office/word/2010/wordml" xmlns:w15="http://schemas.microsoft.com/office/word/2012/wordml" xmlns:w16cex="http://schemas.microsoft.com/office/word/2018/wordml/cex" xmlns:w16cid="http://schemas.microsoft.com/office/word/2016/wordml/cid" xmlns:w16="http://schemas.microsoft.com/office/word/2018/wordml" xmlns:w16du="http://schemas.microsoft.com/office/word/2023/wordml/word16du" xmlns:w16sdtdh="http://schemas.microsoft.com/office/word/2020/wordml/sdtdatahash" xmlns:w16sdtfl="http://schemas.microsoft.com/office/word/2024/wordml/sdtformatlock" xmlns:w16se="http://schemas.microsoft.com/office/word/2015/wordml/symex" xmlns:sl="http://schemas.openxmlformats.org/schemaLibrary/2006/main" mc:Ignorable="w14 w15 w16se w16cid w16 w16cex w16sdtdh w16sdtfl w16du">
-  <w:zoom w:percent="120"/>
-  <w:defaultTabStop w:val="708"/>
-  <w:hyphenationZone w:val="425"/>
-  <w:characterSpacingControl w:val="doNotCompress"/>
-  <w:hdrShapeDefaults>
-    <o:shapedefaults v:ext="edit" spidmax="2050"/>
-    <o:shapelayout v:ext="edit">
-      <o:idmap v:ext="edit" data="1"/>
-    </o:shapelayout>
-  </w:hdrShapeDefaults>
-  <w:footnotePr>
-    <w:footnote w:id="-1"/>
-    <w:footnote w:id="0"/>
-  </w:footnotePr>
-  <w:endnotePr>
-    <w:endnote w:id="-1"/>
-    <w:endnote w:id="0"/>
-  </w:endnotePr>
-  <w:compat>
-    <w:compatSetting w:name="compatibilityMode" w:uri="http://schemas.microsoft.com/office/word" w:val="15"/>
-    <w:compatSetting w:name="overrideTableStyleFontSizeAndJustification" w:uri="http://schemas.microsoft.com/office/word" w:val="1"/>
-    <w:compatSetting w:name="enableOpenTypeFeatures" w:uri="http://schemas.microsoft.com/office/word" w:val="1"/>
-    <w:compatSetting w:name="doNotFlipMirrorIndents" w:uri="http://schemas.microsoft.com/office/word" w:val="1"/>
-    <w:compatSetting w:name="differentiateMultirowTableHeaders" w:uri="http://schemas.microsoft.com/office/word" w:val="1"/>
-    <w:compatSetting w:name="useWord2013TrackBottomHyphenation" w:uri="http://schemas.microsoft.com/office/word" w:val="0"/>
-  </w:compat>
-  <w:rsids>
-    <w:rsidRoot w:val="00CF5CF2"/>
-    <w:rsid w:val="000147E5"/>
-    <w:rsid w:val="00025BF5"/>
-    <w:rsid w:val="000721F2"/>
-    <w:rsid w:val="000759EC"/>
-    <w:rsid w:val="00085434"/>
-    <w:rsid w:val="000907A8"/>
-    <w:rsid w:val="00091A3B"/>
-    <w:rsid w:val="000C0A80"/>
-    <w:rsid w:val="000C79D8"/>
-    <w:rsid w:val="001346AF"/>
-    <w:rsid w:val="00136B54"/>
-    <w:rsid w:val="00152F5C"/>
-    <w:rsid w:val="001939E4"/>
-    <w:rsid w:val="001B5153"/>
-    <w:rsid w:val="001C201A"/>
-    <w:rsid w:val="001E1749"/>
-    <w:rsid w:val="001F18EA"/>
-    <w:rsid w:val="001F2A49"/>
-    <w:rsid w:val="00220DBF"/>
-    <w:rsid w:val="002309D4"/>
-    <w:rsid w:val="002530F1"/>
-    <w:rsid w:val="002571D0"/>
-    <w:rsid w:val="00261548"/>
-    <w:rsid w:val="002658A5"/>
-    <w:rsid w:val="002740BB"/>
-    <w:rsid w:val="002B6C94"/>
-    <w:rsid w:val="002C31D0"/>
-    <w:rsid w:val="00321A31"/>
-    <w:rsid w:val="00347351"/>
-    <w:rsid w:val="003F1BD7"/>
-    <w:rsid w:val="0040159A"/>
-    <w:rsid w:val="0043749E"/>
-    <w:rsid w:val="00442875"/>
-    <w:rsid w:val="004703C5"/>
-    <w:rsid w:val="004947A4"/>
-    <w:rsid w:val="004B779F"/>
-    <w:rsid w:val="004C34E6"/>
-    <w:rsid w:val="004D47EB"/>
-    <w:rsid w:val="0051283F"/>
-    <w:rsid w:val="00522E17"/>
-    <w:rsid w:val="00564C56"/>
-    <w:rsid w:val="00593604"/>
-    <w:rsid w:val="005B4555"/>
-    <w:rsid w:val="005E6736"/>
-    <w:rsid w:val="006E2850"/>
-    <w:rsid w:val="006F28AA"/>
-    <w:rsid w:val="006F4D5F"/>
-    <w:rsid w:val="00717903"/>
-    <w:rsid w:val="0072140D"/>
-    <w:rsid w:val="00724A46"/>
-    <w:rsid w:val="007666A4"/>
-    <w:rsid w:val="007F0BF0"/>
-    <w:rsid w:val="0084493E"/>
-    <w:rsid w:val="008703FA"/>
-    <w:rsid w:val="008826DF"/>
-    <w:rsid w:val="009B232A"/>
-    <w:rsid w:val="009B567A"/>
-    <w:rsid w:val="009C668D"/>
-    <w:rsid w:val="009D2AA6"/>
-    <w:rsid w:val="00A357FB"/>
-    <w:rsid w:val="00A473EA"/>
-    <w:rsid w:val="00AA6A20"/>
-    <w:rsid w:val="00AF7644"/>
-    <w:rsid w:val="00B76EEF"/>
-    <w:rsid w:val="00B958ED"/>
-    <w:rsid w:val="00BB3CFA"/>
-    <w:rsid w:val="00BD55CA"/>
-    <w:rsid w:val="00BD71E8"/>
-    <w:rsid w:val="00BE0EF4"/>
-    <w:rsid w:val="00BE1A03"/>
-    <w:rsid w:val="00BE3645"/>
-    <w:rsid w:val="00BF6B73"/>
-    <w:rsid w:val="00BF78C0"/>
-    <w:rsid w:val="00C04E4E"/>
-    <w:rsid w:val="00C55A36"/>
-    <w:rsid w:val="00C81ACA"/>
-    <w:rsid w:val="00C9436F"/>
-    <w:rsid w:val="00CA69F1"/>
-    <w:rsid w:val="00CC1C0C"/>
-    <w:rsid w:val="00CD0796"/>
-    <w:rsid w:val="00CD07D4"/>
-    <w:rsid w:val="00CF07B3"/>
-    <w:rsid w:val="00CF5CF2"/>
-    <w:rsid w:val="00DA4394"/>
-    <w:rsid w:val="00DE5DE6"/>
-    <w:rsid w:val="00E01A44"/>
-    <w:rsid w:val="00E02E7E"/>
-    <w:rsid w:val="00E078BD"/>
-    <w:rsid w:val="00E517B7"/>
-    <w:rsid w:val="00E576B3"/>
-    <w:rsid w:val="00E71F4D"/>
-    <w:rsid w:val="00E90A4D"/>
-    <w:rsid w:val="00EE37D9"/>
-    <w:rsid w:val="00EF6757"/>
-    <w:rsid w:val="00F24228"/>
-    <w:rsid w:val="00F55A37"/>
-    <w:rsid w:val="00F84956"/>
-    <w:rsid w:val="00F91181"/>
-    <w:rsid w:val="00FB0AE2"/>
-    <w:rsid w:val="00FB1A7E"/>
-    <w:rsid w:val="00FD5C41"/>
-    <w:rsid w:val="00FF2158"/>
-    <w:rsid w:val="00FF31A8"/>
-  </w:rsids>
-  <m:mathPr>
-    <m:mathFont m:val="Cambria Math"/>
-    <m:brkBin m:val="before"/>
-    <m:brkBinSub m:val="--"/>
-    <m:smallFrac m:val="0"/>
-    <m:dispDef/>
-    <m:lMargin m:val="0"/>
-    <m:rMargin m:val="0"/>
-    <m:defJc m:val="centerGroup"/>
-    <m:wrapIndent m:val="1440"/>
-    <m:intLim m:val="subSup"/>
-    <m:naryLim m:val="undOvr"/>
-  </m:mathPr>
-  <w:themeFontLang w:val="pt-BR"/>
-  <w:clrSchemeMapping w:bg1="light1" w:t1="dark1" w:bg2="light2" w:t2="dark2" w:accent1="accent1" w:accent2="accent2" w:accent3="accent3" w:accent4="accent4" w:accent5="accent5" w:accent6="accent6" w:hyperlink="hyperlink" w:followedHyperlink="followedHyperlink"/>
-  <w:shapeDefaults>
-    <o:shapedefaults v:ext="edit" spidmax="2050"/>
-    <o:shapelayout v:ext="edit">
-      <o:idmap v:ext="edit" data="2"/>
-    </o:shapelayout>
-  </w:shapeDefaults>
-  <w:decimalSymbol w:val=","/>
-  <w:listSeparator w:val=";"/>
-  <w14:docId w14:val="5BC84B6A"/>
-  <w15:chartTrackingRefBased/>
-  <w15:docId w15:val="{22371856-A803-4045-95C2-2BC7A11F5836}"/>
-</w:settings>
-</file>
-
-<file path=word\styles.xml><?xml version="1.0" encoding="utf-8"?>
+<file path=word/styles.xml><?xml version="1.0" encoding="utf-8"?>
 <w:styles xmlns:mc="http://schemas.openxmlformats.org/markup-compatibility/2006" xmlns:r="http://schemas.openxmlformats.org/officeDocument/2006/relationships" xmlns:w="http://schemas.openxmlformats.org/wordprocessingml/2006/main" xmlns:w14="http://schemas.microsoft.com/office/word/2010/wordml" xmlns:w15="http://schemas.microsoft.com/office/word/2012/wordml" xmlns:w16cex="http://schemas.microsoft.com/office/word/2018/wordml/cex" xmlns:w16cid="http://schemas.microsoft.com/office/word/2016/wordml/cid" xmlns:w16="http://schemas.microsoft.com/office/word/2018/wordml" xmlns:w16du="http://schemas.microsoft.com/office/word/2023/wordml/word16du" xmlns:w16sdtdh="http://schemas.microsoft.com/office/word/2020/wordml/sdtdatahash" xmlns:w16sdtfl="http://schemas.microsoft.com/office/word/2024/wordml/sdtformatlock" xmlns:w16se="http://schemas.microsoft.com/office/word/2015/wordml/symex" mc:Ignorable="w14 w15 w16se w16cid w16 w16cex w16sdtdh w16sdtfl w16du">
   <w:docDefaults>
     <w:rPrDefault>
@@ -8613,7 +8016,7 @@
 </w:styles>
 </file>
 
-<file path=word\theme\theme1.xml><?xml version="1.0" encoding="utf-8"?>
+<file path=word/theme/theme1.xml><?xml version="1.0" encoding="utf-8"?>
 <a:theme xmlns:a="http://schemas.openxmlformats.org/drawingml/2006/main" name="Tema do Office">
   <a:themeElements>
     <a:clrScheme name="Office">
@@ -8926,11 +8329,4 @@
     </a:ext>
   </a:extLst>
 </a:theme>
-</file>
-
-<file path=word\webSettings.xml><?xml version="1.0" encoding="utf-8"?>
-<w:webSettings xmlns:mc="http://schemas.openxmlformats.org/markup-compatibility/2006" xmlns:r="http://schemas.openxmlformats.org/officeDocument/2006/relationships" xmlns:w="http://schemas.openxmlformats.org/wordprocessingml/2006/main" xmlns:w14="http://schemas.microsoft.com/office/word/2010/wordml" xmlns:w15="http://schemas.microsoft.com/office/word/2012/wordml" xmlns:w16cex="http://schemas.microsoft.com/office/word/2018/wordml/cex" xmlns:w16cid="http://schemas.microsoft.com/office/word/2016/wordml/cid" xmlns:w16="http://schemas.microsoft.com/office/word/2018/wordml" xmlns:w16du="http://schemas.microsoft.com/office/word/2023/wordml/word16du" xmlns:w16sdtdh="http://schemas.microsoft.com/office/word/2020/wordml/sdtdatahash" xmlns:w16sdtfl="http://schemas.microsoft.com/office/word/2024/wordml/sdtformatlock" xmlns:w16se="http://schemas.microsoft.com/office/word/2015/wordml/symex" mc:Ignorable="w14 w15 w16se w16cid w16 w16cex w16sdtdh w16sdtfl w16du">
-  <w:optimizeForBrowser/>
-  <w:allowPNG/>
-</w:webSettings>
 </file>
</xml_diff>